<commit_message>
Buổi 2 — Thiết kế kiến trúc ứng dụng AI
Nhánh này kế thừa toàn bộ buổi 1 và bổ sung tài liệu thực hành buổi 2.
Mã nguồn không đổi so với buổi 1: Lab 2 là bài thiết kế, học viên đọc
Starter Kit rồi viết docs/blueprint.md và ADR, chưa có khối mã cần điền.

- Workbook 2 thiết kế lại bám slide Session 2: phân rã 5 tầng, ranh giới
  và Workflow/Agent, Tool Contract, chiến lược model, 4 design pattern,
  Blueprint 7 mục, ADR (bản Word và bản Markdown để sao chép)
- Lab 2 đồng bộ với workbook: 6 bước, thang điểm 10

Không kèm đáp án: docs/canvas.md và docs/blueprint.md mẫu của giảng viên
được loại khỏi nhánh, học viên tự viết deliverable của nhóm.

Co-Authored-By: Claude Sonnet 5 <noreply@anthropic.com>
</commit_message>
<xml_diff>
--- a/tai-lieu-hoc-vien/labs/LAB-2.docx
+++ b/tai-lieu-hoc-vien/labs/LAB-2.docx
@@ -107,7 +107,7 @@
           <w:sz w:val="18"/>
           <w:szCs w:val="18"/>
         </w:rPr>
-        <w:t xml:space="preserve">Đề bài cho học viên · Deliverable: docs/blueprint.md + 5 ADR</w:t>
+        <w:t xml:space="preserve">Đề bài — đọc kèm Workbook 2 và slide Session 2 · Deliverable: docs/blueprint.md + 5 ADR</w:t>
       </w:r>
     </w:p>
     <w:p>
@@ -137,67 +137,19 @@
     </w:p>
     <w:p>
       <w:pPr>
-        <w:spacing w:after="60"/>
-      </w:pPr>
-      <w:r>
-        <w:rPr>
-          <w:rFonts w:ascii="Calibri" w:cs="Calibri" w:eastAsia="Calibri" w:hAnsi="Calibri"/>
-          <w:b/>
-          <w:bCs/>
-          <w:color w:val="0B3F41"/>
-          <w:sz w:val="20"/>
-          <w:szCs w:val="20"/>
-        </w:rPr>
-        <w:t xml:space="preserve">Session: </w:t>
-      </w:r>
-      <w:r>
-        <w:rPr>
-          <w:rFonts w:ascii="Calibri" w:cs="Calibri" w:eastAsia="Calibri" w:hAnsi="Calibri"/>
-          <w:color w:val="1B1F1F"/>
-          <w:sz w:val="20"/>
-          <w:szCs w:val="20"/>
-        </w:rPr>
-        <w:t xml:space="preserve">2 · Ngày 1, buổi chiều · 120 phút thực hành</w:t>
-      </w:r>
-    </w:p>
-    <w:p>
-      <w:pPr>
-        <w:spacing w:after="60"/>
-      </w:pPr>
-      <w:r>
-        <w:rPr>
-          <w:rFonts w:ascii="Calibri" w:cs="Calibri" w:eastAsia="Calibri" w:hAnsi="Calibri"/>
-          <w:b/>
-          <w:bCs/>
-          <w:color w:val="0B3F41"/>
-          <w:sz w:val="20"/>
-          <w:szCs w:val="20"/>
-        </w:rPr>
-        <w:t xml:space="preserve">Deliverable: </w:t>
-      </w:r>
-      <w:r>
-        <w:rPr>
-          <w:rFonts w:ascii="Consolas" w:cs="Consolas" w:eastAsia="Consolas" w:hAnsi="Consolas"/>
-          <w:color w:val="0B3F41"/>
-          <w:sz w:val="19"/>
-          <w:szCs w:val="19"/>
-        </w:rPr>
-        <w:t xml:space="preserve">docs/blueprint.md</w:t>
-      </w:r>
-      <w:r>
-        <w:rPr>
-          <w:rFonts w:ascii="Calibri" w:cs="Calibri" w:eastAsia="Calibri" w:hAnsi="Calibri"/>
-          <w:color w:val="1B1F1F"/>
-          <w:sz w:val="20"/>
-          <w:szCs w:val="20"/>
-        </w:rPr>
-        <w:t xml:space="preserve"> + 5 ADR</w:t>
-      </w:r>
-    </w:p>
-    <w:p>
-      <w:pPr>
-        <w:spacing w:after="100"/>
-      </w:pPr>
+        <w:spacing w:after="140" w:line="300"/>
+      </w:pPr>
+      <w:r>
+        <w:rPr>
+          <w:rFonts w:ascii="Calibri" w:cs="Calibri" w:eastAsia="Calibri" w:hAnsi="Calibri"/>
+          <w:b/>
+          <w:bCs/>
+          <w:color w:val="1B1F1F"/>
+          <w:sz w:val="21"/>
+          <w:szCs w:val="21"/>
+        </w:rPr>
+        <w:t xml:space="preserve">Session 2 · Ngày 1, buổi chiều · 120 phút thực hành · Deliverable: docs/blueprint.md + 5 ADR</w:t>
+      </w:r>
     </w:p>
     <w:p>
       <w:pPr>
@@ -233,7 +185,7 @@
           <w:sz w:val="20"/>
           <w:szCs w:val="20"/>
         </w:rPr>
-        <w:t xml:space="preserve"> sao chép </w:t>
+        <w:t xml:space="preserve"> dùng </w:t>
       </w:r>
       <w:r>
         <w:rPr>
@@ -244,7 +196,7 @@
           <w:sz w:val="19"/>
           <w:szCs w:val="19"/>
         </w:rPr>
-        <w:t xml:space="preserve">workbooks/WORKBOOK-2.md</w:t>
+        <w:t xml:space="preserve">WORKBOOK-2</w:t>
       </w:r>
       <w:r>
         <w:rPr>
@@ -255,7 +207,7 @@
           <w:sz w:val="20"/>
           <w:szCs w:val="20"/>
         </w:rPr>
-        <w:t xml:space="preserve"> vào </w:t>
+        <w:t xml:space="preserve"> (bản Word ở </w:t>
       </w:r>
       <w:r>
         <w:rPr>
@@ -266,7 +218,7 @@
           <w:sz w:val="19"/>
           <w:szCs w:val="19"/>
         </w:rPr>
-        <w:t xml:space="preserve">docs/workbook/&lt;tên-nhóm&gt;-session-2.md</w:t>
+        <w:t xml:space="preserve">tai-lieu-hoc-vien/workbooks/WORKBOOK-2.docx</w:t>
       </w:r>
       <w:r>
         <w:rPr>
@@ -277,18 +229,18 @@
           <w:sz w:val="20"/>
           <w:szCs w:val="20"/>
         </w:rPr>
-        <w:t xml:space="preserve"> và điền trong giờ học. Đề bài này nói </w:t>
-      </w:r>
-      <w:r>
-        <w:rPr>
-          <w:rFonts w:ascii="Calibri" w:cs="Calibri" w:eastAsia="Calibri" w:hAnsi="Calibri"/>
+        <w:t xml:space="preserve">, bản văn bản ở </w:t>
+      </w:r>
+      <w:r>
+        <w:rPr>
+          <w:rFonts w:ascii="Consolas" w:cs="Consolas" w:eastAsia="Consolas" w:hAnsi="Consolas"/>
           <w:i/>
           <w:iCs/>
-          <w:color w:val="1B1F1F"/>
-          <w:sz w:val="20"/>
-          <w:szCs w:val="20"/>
-        </w:rPr>
-        <w:t xml:space="preserve">phải làm gì</w:t>
+          <w:color w:val="0B3F41"/>
+          <w:sz w:val="19"/>
+          <w:szCs w:val="19"/>
+        </w:rPr>
+        <w:t xml:space="preserve">workbooks/WORKBOOK-2.md</w:t>
       </w:r>
       <w:r>
         <w:rPr>
@@ -299,7 +251,7 @@
           <w:sz w:val="20"/>
           <w:szCs w:val="20"/>
         </w:rPr>
-        <w:t xml:space="preserve">; workbook là chỗ ghi </w:t>
+        <w:t xml:space="preserve">) và điền trong giờ học. Đề bài này nói </w:t>
       </w:r>
       <w:r>
         <w:rPr>
@@ -310,7 +262,7 @@
           <w:sz w:val="20"/>
           <w:szCs w:val="20"/>
         </w:rPr>
-        <w:t xml:space="preserve">đã đo được gì và vì sao chọn như vậy</w:t>
+        <w:t xml:space="preserve">phải làm gì</w:t>
       </w:r>
       <w:r>
         <w:rPr>
@@ -321,7 +273,59 @@
           <w:sz w:val="20"/>
           <w:szCs w:val="20"/>
         </w:rPr>
+        <w:t xml:space="preserve">; workbook là chỗ ghi </w:t>
+      </w:r>
+      <w:r>
+        <w:rPr>
+          <w:rFonts w:ascii="Calibri" w:cs="Calibri" w:eastAsia="Calibri" w:hAnsi="Calibri"/>
+          <w:i/>
+          <w:iCs/>
+          <w:color w:val="1B1F1F"/>
+          <w:sz w:val="20"/>
+          <w:szCs w:val="20"/>
+        </w:rPr>
+        <w:t xml:space="preserve">đã đo được gì và vì sao chọn như vậy</w:t>
+      </w:r>
+      <w:r>
+        <w:rPr>
+          <w:rFonts w:ascii="Calibri" w:cs="Calibri" w:eastAsia="Calibri" w:hAnsi="Calibri"/>
+          <w:i/>
+          <w:iCs/>
+          <w:color w:val="1B1F1F"/>
+          <w:sz w:val="20"/>
+          <w:szCs w:val="20"/>
+        </w:rPr>
         <w:t xml:space="preserve"> — phần phản biện ở Session 6 hỏi đúng phần đó.</w:t>
+      </w:r>
+      <w:r>
+        <w:br/>
+        <w:t xml:space="preserve"/>
+      </w:r>
+      <w:r>
+        <w:rPr>
+          <w:rFonts w:ascii="Calibri" w:cs="Calibri" w:eastAsia="Calibri" w:hAnsi="Calibri"/>
+          <w:i/>
+          <w:iCs/>
+          <w:color w:val="1B1F1F"/>
+          <w:sz w:val="20"/>
+          <w:szCs w:val="20"/>
+        </w:rPr>
+        <w:t xml:space="preserve"/>
+      </w:r>
+      <w:r>
+        <w:br/>
+        <w:t xml:space="preserve"/>
+      </w:r>
+      <w:r>
+        <w:rPr>
+          <w:rFonts w:ascii="Calibri" w:cs="Calibri" w:eastAsia="Calibri" w:hAnsi="Calibri"/>
+          <w:i/>
+          <w:iCs/>
+          <w:color w:val="1B1F1F"/>
+          <w:sz w:val="20"/>
+          <w:szCs w:val="20"/>
+        </w:rPr>
+        <w:t xml:space="preserve">Bài này đi theo slide Session 2. Workbook ghi số slide ở từng bước — mở slide song song khi làm.</w:t>
       </w:r>
     </w:p>
     <w:p>
@@ -349,7 +353,7 @@
           <w:sz w:val="24"/>
           <w:szCs w:val="24"/>
         </w:rPr>
-        <w:t xml:space="preserve">Bước 1 — Giải phẫu Starter Kit (30 phút)</w:t>
+        <w:t xml:space="preserve">Bước 1 — Phân rã: các thành phần của một ứng dụng AI (20 phút)</w:t>
       </w:r>
     </w:p>
     <w:p>
@@ -383,7 +387,7 @@
           <w:sz w:val="21"/>
           <w:szCs w:val="21"/>
         </w:rPr>
-        <w:t xml:space="preserve"> ba câu:</w:t>
+        <w:t xml:space="preserve">:</w:t>
       </w:r>
     </w:p>
     <w:p>
@@ -437,25 +441,7 @@
           <w:sz w:val="21"/>
           <w:szCs w:val="21"/>
         </w:rPr>
-        <w:t xml:space="preserve">Mỗi tệp trong </w:t>
-      </w:r>
-      <w:r>
-        <w:rPr>
-          <w:rFonts w:ascii="Consolas" w:cs="Consolas" w:eastAsia="Consolas" w:hAnsi="Consolas"/>
-          <w:color w:val="0B3F41"/>
-          <w:sz w:val="20"/>
-          <w:szCs w:val="20"/>
-        </w:rPr>
-        <w:t xml:space="preserve">src/</w:t>
-      </w:r>
-      <w:r>
-        <w:rPr>
-          <w:rFonts w:ascii="Calibri" w:cs="Calibri" w:eastAsia="Calibri" w:hAnsi="Calibri"/>
-          <w:color w:val="1B1F1F"/>
-          <w:sz w:val="21"/>
-          <w:szCs w:val="21"/>
-        </w:rPr>
-        <w:t xml:space="preserve"> chịu trách nhiệm gì?</w:t>
+        <w:t xml:space="preserve">Slide 10 chia ứng dụng AI thành năm tầng (Experience, Orchestration, Intelligence, Context &amp; Knowledge, Tools &amp; Enterprise Systems) cùng hai thành phần xuyên suốt (Security &amp; Guardrails, AI Platform &amp; Operations). Mỗi thành phần đó nằm ở tệp nào trong repo, và chịu trách nhiệm gì?</w:t>
       </w:r>
     </w:p>
     <w:p>
@@ -550,7 +536,7 @@
           <w:sz w:val="21"/>
           <w:szCs w:val="21"/>
         </w:rPr>
-        <w:t xml:space="preserve"> sơ đồ phụ thuộc giữa các module.</w:t>
+        <w:t xml:space="preserve"> bản đồ thành phần — mỗi thành phần của slide gắn với tệp trong repo.</w:t>
       </w:r>
     </w:p>
     <w:p>
@@ -578,7 +564,212 @@
           <w:sz w:val="24"/>
           <w:szCs w:val="24"/>
         </w:rPr>
-        <w:t xml:space="preserve">Bước 2 — Thí nghiệm so sánh cấu hình (25 phút)</w:t>
+        <w:t xml:space="preserve">Bước 2 — Xác định ranh giới và cách điều phối (20 phút)</w:t>
+      </w:r>
+    </w:p>
+    <w:p>
+      <w:pPr>
+        <w:tabs>
+          <w:tab w:val="left" w:pos="420"/>
+        </w:tabs>
+        <w:spacing w:after="70" w:line="300"/>
+        <w:ind w:left="420" w:hanging="300"/>
+      </w:pPr>
+      <w:r>
+        <w:rPr>
+          <w:rFonts w:ascii="Calibri" w:cs="Calibri" w:eastAsia="Calibri" w:hAnsi="Calibri"/>
+          <w:color w:val="1B1F1F"/>
+          <w:sz w:val="21"/>
+          <w:szCs w:val="21"/>
+        </w:rPr>
+        <w:t xml:space="preserve">1.	</w:t>
+      </w:r>
+      <w:r>
+        <w:rPr>
+          <w:rFonts w:ascii="Calibri" w:cs="Calibri" w:eastAsia="Calibri" w:hAnsi="Calibri"/>
+          <w:b/>
+          <w:bCs/>
+          <w:color w:val="1B1F1F"/>
+          <w:sz w:val="21"/>
+          <w:szCs w:val="21"/>
+        </w:rPr>
+        <w:t xml:space="preserve">Ai quyết định gì (slide 8):</w:t>
+      </w:r>
+      <w:r>
+        <w:rPr>
+          <w:rFonts w:ascii="Calibri" w:cs="Calibri" w:eastAsia="Calibri" w:hAnsi="Calibri"/>
+          <w:color w:val="1B1F1F"/>
+          <w:sz w:val="21"/>
+          <w:szCs w:val="21"/>
+        </w:rPr>
+        <w:t xml:space="preserve"> với bốn vai trò — AI, ứng dụng nghiệp vụ, hệ thống nghiệp vụ/dữ liệu, con người — ghi rõ việc được quyết định và việc </w:t>
+      </w:r>
+      <w:r>
+        <w:rPr>
+          <w:rFonts w:ascii="Calibri" w:cs="Calibri" w:eastAsia="Calibri" w:hAnsi="Calibri"/>
+          <w:b/>
+          <w:bCs/>
+          <w:color w:val="1B1F1F"/>
+          <w:sz w:val="21"/>
+          <w:szCs w:val="21"/>
+        </w:rPr>
+        <w:t xml:space="preserve">không được</w:t>
+      </w:r>
+      <w:r>
+        <w:rPr>
+          <w:rFonts w:ascii="Calibri" w:cs="Calibri" w:eastAsia="Calibri" w:hAnsi="Calibri"/>
+          <w:color w:val="1B1F1F"/>
+          <w:sz w:val="21"/>
+          <w:szCs w:val="21"/>
+        </w:rPr>
+        <w:t xml:space="preserve"> làm. Xác định mô hình tương tác (slide 12) và mức tự chủ trên thang Ask → Assist → Suggest → Act.</w:t>
+      </w:r>
+    </w:p>
+    <w:p>
+      <w:pPr>
+        <w:tabs>
+          <w:tab w:val="left" w:pos="420"/>
+        </w:tabs>
+        <w:spacing w:after="70" w:line="300"/>
+        <w:ind w:left="420" w:hanging="300"/>
+      </w:pPr>
+      <w:r>
+        <w:rPr>
+          <w:rFonts w:ascii="Calibri" w:cs="Calibri" w:eastAsia="Calibri" w:hAnsi="Calibri"/>
+          <w:color w:val="1B1F1F"/>
+          <w:sz w:val="21"/>
+          <w:szCs w:val="21"/>
+        </w:rPr>
+        <w:t xml:space="preserve">2.	</w:t>
+      </w:r>
+      <w:r>
+        <w:rPr>
+          <w:rFonts w:ascii="Calibri" w:cs="Calibri" w:eastAsia="Calibri" w:hAnsi="Calibri"/>
+          <w:b/>
+          <w:bCs/>
+          <w:color w:val="1B1F1F"/>
+          <w:sz w:val="21"/>
+          <w:szCs w:val="21"/>
+        </w:rPr>
+        <w:t xml:space="preserve">Workflow hay Agent (slide 16):</w:t>
+      </w:r>
+      <w:r>
+        <w:rPr>
+          <w:rFonts w:ascii="Calibri" w:cs="Calibri" w:eastAsia="Calibri" w:hAnsi="Calibri"/>
+          <w:color w:val="1B1F1F"/>
+          <w:sz w:val="21"/>
+          <w:szCs w:val="21"/>
+        </w:rPr>
+        <w:t xml:space="preserve"> đi lần lượt bốn câu hỏi quyết định, mỗi câu trả lời kèm bằng chứng từ code, rồi chọn một trong bốn mức. Trả lời câu thảo luận ở slide 17.</w:t>
+      </w:r>
+    </w:p>
+    <w:p>
+      <w:pPr>
+        <w:tabs>
+          <w:tab w:val="left" w:pos="420"/>
+        </w:tabs>
+        <w:spacing w:after="70" w:line="300"/>
+        <w:ind w:left="420" w:hanging="300"/>
+      </w:pPr>
+      <w:r>
+        <w:rPr>
+          <w:rFonts w:ascii="Calibri" w:cs="Calibri" w:eastAsia="Calibri" w:hAnsi="Calibri"/>
+          <w:color w:val="1B1F1F"/>
+          <w:sz w:val="21"/>
+          <w:szCs w:val="21"/>
+        </w:rPr>
+        <w:t xml:space="preserve">3.	</w:t>
+      </w:r>
+      <w:r>
+        <w:rPr>
+          <w:rFonts w:ascii="Calibri" w:cs="Calibri" w:eastAsia="Calibri" w:hAnsi="Calibri"/>
+          <w:b/>
+          <w:bCs/>
+          <w:color w:val="1B1F1F"/>
+          <w:sz w:val="21"/>
+          <w:szCs w:val="21"/>
+        </w:rPr>
+        <w:t xml:space="preserve">Tool Contract (slide 22):</w:t>
+      </w:r>
+      <w:r>
+        <w:rPr>
+          <w:rFonts w:ascii="Calibri" w:cs="Calibri" w:eastAsia="Calibri" w:hAnsi="Calibri"/>
+          <w:color w:val="1B1F1F"/>
+          <w:sz w:val="21"/>
+          <w:szCs w:val="21"/>
+        </w:rPr>
+        <w:t xml:space="preserve"> chọn một tool trong </w:t>
+      </w:r>
+      <w:r>
+        <w:rPr>
+          <w:rFonts w:ascii="Consolas" w:cs="Consolas" w:eastAsia="Consolas" w:hAnsi="Consolas"/>
+          <w:color w:val="0B3F41"/>
+          <w:sz w:val="20"/>
+          <w:szCs w:val="20"/>
+        </w:rPr>
+        <w:t xml:space="preserve">src/agent/tools.py</w:t>
+      </w:r>
+      <w:r>
+        <w:rPr>
+          <w:rFonts w:ascii="Calibri" w:cs="Calibri" w:eastAsia="Calibri" w:hAnsi="Calibri"/>
+          <w:color w:val="1B1F1F"/>
+          <w:sz w:val="21"/>
+          <w:szCs w:val="21"/>
+        </w:rPr>
+        <w:t xml:space="preserve"> và mô tả năm phần hợp đồng — Input, Permission, Business Rules, Execution, Output. Phần nào chưa có trong code thì ghi "chưa có". Giải thích vì sao model không nên truy cập thẳng dữ liệu (slide 23).</w:t>
+      </w:r>
+    </w:p>
+    <w:p>
+      <w:pPr>
+        <w:spacing w:after="140" w:line="300"/>
+      </w:pPr>
+      <w:r>
+        <w:rPr>
+          <w:rFonts w:ascii="Calibri" w:cs="Calibri" w:eastAsia="Calibri" w:hAnsi="Calibri"/>
+          <w:b/>
+          <w:bCs/>
+          <w:color w:val="1B1F1F"/>
+          <w:sz w:val="21"/>
+          <w:szCs w:val="21"/>
+        </w:rPr>
+        <w:t xml:space="preserve">Sản phẩm:</w:t>
+      </w:r>
+      <w:r>
+        <w:rPr>
+          <w:rFonts w:ascii="Calibri" w:cs="Calibri" w:eastAsia="Calibri" w:hAnsi="Calibri"/>
+          <w:color w:val="1B1F1F"/>
+          <w:sz w:val="21"/>
+          <w:szCs w:val="21"/>
+        </w:rPr>
+        <w:t xml:space="preserve"> bảng ranh giới, mức Workflow/Agent đã chọn, Tool Contract của một tool.</w:t>
+      </w:r>
+    </w:p>
+    <w:p>
+      <w:pPr>
+        <w:pBdr>
+          <w:bottom w:val="single" w:color="BFD3D2" w:sz="4" w:space="1"/>
+        </w:pBdr>
+        <w:spacing w:after="200" w:before="120"/>
+      </w:pPr>
+      <w:r>
+        <w:t xml:space="preserve"/>
+      </w:r>
+    </w:p>
+    <w:p>
+      <w:pPr>
+        <w:pStyle w:val="Heading2"/>
+        <w:spacing w:after="120" w:before="280"/>
+      </w:pPr>
+      <w:r>
+        <w:rPr>
+          <w:rFonts w:ascii="Calibri" w:cs="Calibri" w:eastAsia="Calibri" w:hAnsi="Calibri"/>
+          <w:b/>
+          <w:bCs/>
+          <w:color w:val="0B3F41"/>
+          <w:sz w:val="24"/>
+          <w:szCs w:val="24"/>
+        </w:rPr>
+        <w:t xml:space="preserve">Bước 3 — Chiến lược model (20 phút)</w:t>
       </w:r>
     </w:p>
     <w:p>
@@ -614,21 +805,7 @@
           <w:sz w:val="21"/>
           <w:szCs w:val="21"/>
         </w:rPr>
-        <w:t xml:space="preserve">Chạy trên cùng 5 ticket với bốn tổ hợp: cấu hình S, cấu hình L, và cấu hình chuẩn của lớp ở hai mức nhiệt độ.</w:t>
-      </w:r>
-    </w:p>
-    <w:p>
-      <w:pPr>
-        <w:spacing w:after="140" w:line="300"/>
-      </w:pPr>
-      <w:r>
-        <w:rPr>
-          <w:rFonts w:ascii="Calibri" w:cs="Calibri" w:eastAsia="Calibri" w:hAnsi="Calibri"/>
-          <w:color w:val="1B1F1F"/>
-          <w:sz w:val="21"/>
-          <w:szCs w:val="21"/>
-        </w:rPr>
-        <w:t xml:space="preserve">Ghi lại thời gian phản hồi và nhận xét chất lượng, </w:t>
+        <w:t xml:space="preserve">Chạy trên cùng 5 ticket với bốn tổ hợp: cấu hình S, cấu hình L, và hai mức nhiệt độ (0.0 và 0.7). Ghi lại độ chính xác, p50 và số ca phải cứu bằng lớp phòng vệ, </w:t>
       </w:r>
       <w:r>
         <w:rPr>
@@ -648,7 +825,7 @@
           <w:sz w:val="21"/>
           <w:szCs w:val="21"/>
         </w:rPr>
-        <w:t xml:space="preserve">.</w:t>
+        <w:t xml:space="preserve">. Chạy lệnh trước, làm phần dưới trong lúc chờ.</w:t>
       </w:r>
     </w:p>
     <w:p>
@@ -763,6 +940,96 @@
       <w:r>
         <w:rPr>
           <w:rFonts w:ascii="Calibri" w:cs="Calibri" w:eastAsia="Calibri" w:hAnsi="Calibri"/>
+          <w:color w:val="1B1F1F"/>
+          <w:sz w:val="21"/>
+          <w:szCs w:val="21"/>
+        </w:rPr>
+        <w:t xml:space="preserve">Sau đó:</w:t>
+      </w:r>
+    </w:p>
+    <w:p>
+      <w:pPr>
+        <w:tabs>
+          <w:tab w:val="left" w:pos="420"/>
+        </w:tabs>
+        <w:spacing w:after="70" w:line="300"/>
+        <w:ind w:left="420" w:hanging="300"/>
+      </w:pPr>
+      <w:r>
+        <w:rPr>
+          <w:rFonts w:ascii="Calibri" w:cs="Calibri" w:eastAsia="Calibri" w:hAnsi="Calibri"/>
+          <w:color w:val="1B1F1F"/>
+          <w:sz w:val="21"/>
+          <w:szCs w:val="21"/>
+        </w:rPr>
+        <w:t xml:space="preserve">1.	</w:t>
+      </w:r>
+      <w:r>
+        <w:rPr>
+          <w:rFonts w:ascii="Calibri" w:cs="Calibri" w:eastAsia="Calibri" w:hAnsi="Calibri"/>
+          <w:b/>
+          <w:bCs/>
+          <w:color w:val="1B1F1F"/>
+          <w:sz w:val="21"/>
+          <w:szCs w:val="21"/>
+        </w:rPr>
+        <w:t xml:space="preserve">Chọn model bằng bốn tiêu chí (slide 31):</w:t>
+      </w:r>
+      <w:r>
+        <w:rPr>
+          <w:rFonts w:ascii="Calibri" w:cs="Calibri" w:eastAsia="Calibri" w:hAnsi="Calibri"/>
+          <w:color w:val="1B1F1F"/>
+          <w:sz w:val="21"/>
+          <w:szCs w:val="21"/>
+        </w:rPr>
+        <w:t xml:space="preserve"> phù hợp năng lực, đủ chất lượng, khả thi vận hành, phù hợp doanh nghiệp — mỗi tiêu chí kèm bằng chứng. Nêu một model khác đã cân nhắc và lý do loại.</w:t>
+      </w:r>
+    </w:p>
+    <w:p>
+      <w:pPr>
+        <w:tabs>
+          <w:tab w:val="left" w:pos="420"/>
+        </w:tabs>
+        <w:spacing w:after="70" w:line="300"/>
+        <w:ind w:left="420" w:hanging="300"/>
+      </w:pPr>
+      <w:r>
+        <w:rPr>
+          <w:rFonts w:ascii="Calibri" w:cs="Calibri" w:eastAsia="Calibri" w:hAnsi="Calibri"/>
+          <w:color w:val="1B1F1F"/>
+          <w:sz w:val="21"/>
+          <w:szCs w:val="21"/>
+        </w:rPr>
+        <w:t xml:space="preserve">2.	</w:t>
+      </w:r>
+      <w:r>
+        <w:rPr>
+          <w:rFonts w:ascii="Calibri" w:cs="Calibri" w:eastAsia="Calibri" w:hAnsi="Calibri"/>
+          <w:b/>
+          <w:bCs/>
+          <w:color w:val="1B1F1F"/>
+          <w:sz w:val="21"/>
+          <w:szCs w:val="21"/>
+        </w:rPr>
+        <w:t xml:space="preserve">Một model hay nhiều (slide 32–33):</w:t>
+      </w:r>
+      <w:r>
+        <w:rPr>
+          <w:rFonts w:ascii="Calibri" w:cs="Calibri" w:eastAsia="Calibri" w:hAnsi="Calibri"/>
+          <w:color w:val="1B1F1F"/>
+          <w:sz w:val="21"/>
+          <w:szCs w:val="21"/>
+        </w:rPr>
+        <w:t xml:space="preserve"> hệ thống đang dùng bao nhiêu model, mỗi model làm gì, và dấu hiệu nào sẽ khiến nhóm thêm một model nữa.</w:t>
+      </w:r>
+    </w:p>
+    <w:p>
+      <w:pPr>
+        <w:spacing w:after="140" w:line="300"/>
+      </w:pPr>
+      <w:r>
+        <w:rPr>
+          <w:rFonts w:ascii="Calibri" w:cs="Calibri" w:eastAsia="Calibri" w:hAnsi="Calibri"/>
           <w:b/>
           <w:bCs/>
           <w:color w:val="1B1F1F"/>
@@ -778,7 +1045,7 @@
           <w:sz w:val="21"/>
           <w:szCs w:val="21"/>
         </w:rPr>
-        <w:t xml:space="preserve"> bảng so sánh cấu hình.</w:t>
+        <w:t xml:space="preserve"> bảng so sánh cấu hình và bảng chọn model.</w:t>
       </w:r>
     </w:p>
     <w:p>
@@ -806,24 +1073,179 @@
           <w:sz w:val="24"/>
           <w:szCs w:val="24"/>
         </w:rPr>
-        <w:t xml:space="preserve">Bước 3 — Vẽ Blueprint và viết ADR (40 phút)</w:t>
-      </w:r>
-    </w:p>
-    <w:p>
-      <w:pPr>
-        <w:pStyle w:val="Heading3"/>
-        <w:spacing w:after="90" w:before="180"/>
-      </w:pPr>
-      <w:r>
-        <w:rPr>
-          <w:rFonts w:ascii="Calibri" w:cs="Calibri" w:eastAsia="Calibri" w:hAnsi="Calibri"/>
-          <w:b/>
-          <w:bCs/>
-          <w:color w:val="1B1F1F"/>
-          <w:sz w:val="22"/>
-          <w:szCs w:val="22"/>
-        </w:rPr>
-        <w:t xml:space="preserve">Blueprint 5 tầng</w:t>
+        <w:t xml:space="preserve">Bước 4 — Design Patterns, luồng end-to-end và Blueprint (25 phút)</w:t>
+      </w:r>
+    </w:p>
+    <w:p>
+      <w:pPr>
+        <w:tabs>
+          <w:tab w:val="left" w:pos="420"/>
+        </w:tabs>
+        <w:spacing w:after="70" w:line="300"/>
+        <w:ind w:left="420" w:hanging="300"/>
+      </w:pPr>
+      <w:r>
+        <w:rPr>
+          <w:rFonts w:ascii="Calibri" w:cs="Calibri" w:eastAsia="Calibri" w:hAnsi="Calibri"/>
+          <w:color w:val="1B1F1F"/>
+          <w:sz w:val="21"/>
+          <w:szCs w:val="21"/>
+        </w:rPr>
+        <w:t xml:space="preserve">1.	</w:t>
+      </w:r>
+      <w:r>
+        <w:rPr>
+          <w:rFonts w:ascii="Calibri" w:cs="Calibri" w:eastAsia="Calibri" w:hAnsi="Calibri"/>
+          <w:b/>
+          <w:bCs/>
+          <w:color w:val="1B1F1F"/>
+          <w:sz w:val="21"/>
+          <w:szCs w:val="21"/>
+        </w:rPr>
+        <w:t xml:space="preserve">Chọn pattern (slide 41):</w:t>
+      </w:r>
+      <w:r>
+        <w:rPr>
+          <w:rFonts w:ascii="Calibri" w:cs="Calibri" w:eastAsia="Calibri" w:hAnsi="Calibri"/>
+          <w:color w:val="1B1F1F"/>
+          <w:sz w:val="21"/>
+          <w:szCs w:val="21"/>
+        </w:rPr>
+        <w:t xml:space="preserve"> đi qua năm câu hỏi chọn pattern — Grounded Generation, Controlled Action, AI-Augmented Workflow, Bounded Agent, Human-in-the-Loop. Mỗi pattern được dùng phải chỉ ra được nơi nó nằm trong code; pattern không dùng phải có lý do.</w:t>
+      </w:r>
+    </w:p>
+    <w:p>
+      <w:pPr>
+        <w:tabs>
+          <w:tab w:val="left" w:pos="420"/>
+        </w:tabs>
+        <w:spacing w:after="70" w:line="300"/>
+        <w:ind w:left="420" w:hanging="300"/>
+      </w:pPr>
+      <w:r>
+        <w:rPr>
+          <w:rFonts w:ascii="Calibri" w:cs="Calibri" w:eastAsia="Calibri" w:hAnsi="Calibri"/>
+          <w:color w:val="1B1F1F"/>
+          <w:sz w:val="21"/>
+          <w:szCs w:val="21"/>
+        </w:rPr>
+        <w:t xml:space="preserve">2.	</w:t>
+      </w:r>
+      <w:r>
+        <w:rPr>
+          <w:rFonts w:ascii="Calibri" w:cs="Calibri" w:eastAsia="Calibri" w:hAnsi="Calibri"/>
+          <w:b/>
+          <w:bCs/>
+          <w:color w:val="1B1F1F"/>
+          <w:sz w:val="21"/>
+          <w:szCs w:val="21"/>
+        </w:rPr>
+        <w:t xml:space="preserve">Luồng end-to-end có nhánh lỗi:</w:t>
+      </w:r>
+      <w:r>
+        <w:rPr>
+          <w:rFonts w:ascii="Calibri" w:cs="Calibri" w:eastAsia="Calibri" w:hAnsi="Calibri"/>
+          <w:color w:val="1B1F1F"/>
+          <w:sz w:val="21"/>
+          <w:szCs w:val="21"/>
+        </w:rPr>
+        <w:t xml:space="preserve"> từng bước xử lý một ticket, ghi thành phần chịu trách nhiệm, guardrail đặt tại đó (slide 26 — guardrail phải đặt tại nơi rủi ro phát sinh, không chỉ ở đầu ra cuối) và </w:t>
+      </w:r>
+      <w:r>
+        <w:rPr>
+          <w:rFonts w:ascii="Calibri" w:cs="Calibri" w:eastAsia="Calibri" w:hAnsi="Calibri"/>
+          <w:b/>
+          <w:bCs/>
+          <w:color w:val="1B1F1F"/>
+          <w:sz w:val="21"/>
+          <w:szCs w:val="21"/>
+        </w:rPr>
+        <w:t xml:space="preserve">phương án dự phòng khi bước đó lỗi hoặc không chắc</w:t>
+      </w:r>
+      <w:r>
+        <w:rPr>
+          <w:rFonts w:ascii="Calibri" w:cs="Calibri" w:eastAsia="Calibri" w:hAnsi="Calibri"/>
+          <w:color w:val="1B1F1F"/>
+          <w:sz w:val="21"/>
+          <w:szCs w:val="21"/>
+        </w:rPr>
+        <w:t xml:space="preserve">.</w:t>
+      </w:r>
+    </w:p>
+    <w:p>
+      <w:pPr>
+        <w:tabs>
+          <w:tab w:val="left" w:pos="420"/>
+        </w:tabs>
+        <w:spacing w:after="70" w:line="300"/>
+        <w:ind w:left="420" w:hanging="300"/>
+      </w:pPr>
+      <w:r>
+        <w:rPr>
+          <w:rFonts w:ascii="Calibri" w:cs="Calibri" w:eastAsia="Calibri" w:hAnsi="Calibri"/>
+          <w:color w:val="1B1F1F"/>
+          <w:sz w:val="21"/>
+          <w:szCs w:val="21"/>
+        </w:rPr>
+        <w:t xml:space="preserve">3.	</w:t>
+      </w:r>
+      <w:r>
+        <w:rPr>
+          <w:rFonts w:ascii="Calibri" w:cs="Calibri" w:eastAsia="Calibri" w:hAnsi="Calibri"/>
+          <w:b/>
+          <w:bCs/>
+          <w:color w:val="1B1F1F"/>
+          <w:sz w:val="21"/>
+          <w:szCs w:val="21"/>
+        </w:rPr>
+        <w:t xml:space="preserve">Viết</w:t>
+      </w:r>
+      <w:r>
+        <w:rPr>
+          <w:rFonts w:ascii="Calibri" w:cs="Calibri" w:eastAsia="Calibri" w:hAnsi="Calibri"/>
+          <w:color w:val="1B1F1F"/>
+          <w:sz w:val="21"/>
+          <w:szCs w:val="21"/>
+        </w:rPr>
+        <w:t xml:space="preserve"> </w:t>
+      </w:r>
+      <w:r>
+        <w:rPr>
+          <w:rFonts w:ascii="Consolas" w:cs="Consolas" w:eastAsia="Consolas" w:hAnsi="Consolas"/>
+          <w:color w:val="0B3F41"/>
+          <w:sz w:val="20"/>
+          <w:szCs w:val="20"/>
+        </w:rPr>
+        <w:t xml:space="preserve">docs/blueprint.md</w:t>
+      </w:r>
+      <w:r>
+        <w:rPr>
+          <w:rFonts w:ascii="Calibri" w:cs="Calibri" w:eastAsia="Calibri" w:hAnsi="Calibri"/>
+          <w:color w:val="1B1F1F"/>
+          <w:sz w:val="21"/>
+          <w:szCs w:val="21"/>
+        </w:rPr>
+        <w:t xml:space="preserve"> </w:t>
+      </w:r>
+      <w:r>
+        <w:rPr>
+          <w:rFonts w:ascii="Calibri" w:cs="Calibri" w:eastAsia="Calibri" w:hAnsi="Calibri"/>
+          <w:b/>
+          <w:bCs/>
+          <w:color w:val="1B1F1F"/>
+          <w:sz w:val="21"/>
+          <w:szCs w:val="21"/>
+        </w:rPr>
+        <w:t xml:space="preserve">gồm bảy mục theo slide 43:</w:t>
+      </w:r>
+      <w:r>
+        <w:rPr>
+          <w:rFonts w:ascii="Calibri" w:cs="Calibri" w:eastAsia="Calibri" w:hAnsi="Calibri"/>
+          <w:color w:val="1B1F1F"/>
+          <w:sz w:val="21"/>
+          <w:szCs w:val="21"/>
+        </w:rPr>
+        <w:t xml:space="preserve"> Use Case Contract, Context Contract, Model/Intelligence, Tool Contract, Agent/Workflow, Guardrails &amp; Policy, Evaluation — cùng sơ đồ năm tầng.</w:t>
       </w:r>
     </w:p>
     <w:p>
@@ -837,85 +1259,27 @@
           <w:sz w:val="21"/>
           <w:szCs w:val="21"/>
         </w:rPr>
-        <w:t xml:space="preserve">Với mỗi thành phần, ghi rõ bốn thứ:</w:t>
-      </w:r>
-    </w:p>
-    <w:p>
-      <w:pPr>
-        <w:pStyle w:val="ListParagraph"/>
-        <w:numPr>
-          <w:ilvl w:val="0"/>
-          <w:numId w:val="2"/>
-        </w:numPr>
-        <w:spacing w:after="70" w:line="300"/>
-      </w:pPr>
-      <w:r>
-        <w:rPr>
-          <w:rFonts w:ascii="Calibri" w:cs="Calibri" w:eastAsia="Calibri" w:hAnsi="Calibri"/>
-          <w:color w:val="1B1F1F"/>
-          <w:sz w:val="21"/>
-          <w:szCs w:val="21"/>
-        </w:rPr>
-        <w:t xml:space="preserve">Đầu vào</w:t>
-      </w:r>
-    </w:p>
-    <w:p>
-      <w:pPr>
-        <w:pStyle w:val="ListParagraph"/>
-        <w:numPr>
-          <w:ilvl w:val="0"/>
-          <w:numId w:val="2"/>
-        </w:numPr>
-        <w:spacing w:after="70" w:line="300"/>
-      </w:pPr>
-      <w:r>
-        <w:rPr>
-          <w:rFonts w:ascii="Calibri" w:cs="Calibri" w:eastAsia="Calibri" w:hAnsi="Calibri"/>
-          <w:color w:val="1B1F1F"/>
-          <w:sz w:val="21"/>
-          <w:szCs w:val="21"/>
-        </w:rPr>
-        <w:t xml:space="preserve">Đầu ra</w:t>
-      </w:r>
-    </w:p>
-    <w:p>
-      <w:pPr>
-        <w:pStyle w:val="ListParagraph"/>
-        <w:numPr>
-          <w:ilvl w:val="0"/>
-          <w:numId w:val="2"/>
-        </w:numPr>
-        <w:spacing w:after="70" w:line="300"/>
-      </w:pPr>
-      <w:r>
-        <w:rPr>
-          <w:rFonts w:ascii="Calibri" w:cs="Calibri" w:eastAsia="Calibri" w:hAnsi="Calibri"/>
-          <w:color w:val="1B1F1F"/>
-          <w:sz w:val="21"/>
-          <w:szCs w:val="21"/>
-        </w:rPr>
-        <w:t xml:space="preserve">Kỹ thuật sử dụng</w:t>
-      </w:r>
-    </w:p>
-    <w:p>
-      <w:pPr>
-        <w:pStyle w:val="ListParagraph"/>
-        <w:numPr>
-          <w:ilvl w:val="0"/>
-          <w:numId w:val="2"/>
-        </w:numPr>
-        <w:spacing w:after="70" w:line="300"/>
-      </w:pPr>
-      <w:r>
-        <w:rPr>
-          <w:rFonts w:ascii="Calibri" w:cs="Calibri" w:eastAsia="Calibri" w:hAnsi="Calibri"/>
-          <w:b/>
-          <w:bCs/>
-          <w:color w:val="1B1F1F"/>
-          <w:sz w:val="21"/>
-          <w:szCs w:val="21"/>
-        </w:rPr>
-        <w:t xml:space="preserve">Phương án dự phòng khi thành phần đó gặp sự cố</w:t>
+        <w:t xml:space="preserve">Blueprint mô tả </w:t>
+      </w:r>
+      <w:r>
+        <w:rPr>
+          <w:rFonts w:ascii="Calibri" w:cs="Calibri" w:eastAsia="Calibri" w:hAnsi="Calibri"/>
+          <w:b/>
+          <w:bCs/>
+          <w:color w:val="1B1F1F"/>
+          <w:sz w:val="21"/>
+          <w:szCs w:val="21"/>
+        </w:rPr>
+        <w:t xml:space="preserve">trách nhiệm và giao diện</w:t>
+      </w:r>
+      <w:r>
+        <w:rPr>
+          <w:rFonts w:ascii="Calibri" w:cs="Calibri" w:eastAsia="Calibri" w:hAnsi="Calibri"/>
+          <w:color w:val="1B1F1F"/>
+          <w:sz w:val="21"/>
+          <w:szCs w:val="21"/>
+        </w:rPr>
+        <w:t xml:space="preserve">, không mô tả cách hiện thực bên trong. Vẽ tới mức mã nguồn là lỗi thường gặp nhất ở buổi này.</w:t>
       </w:r>
     </w:p>
     <w:p>
@@ -925,48 +1289,68 @@
       <w:r>
         <w:rPr>
           <w:rFonts w:ascii="Calibri" w:cs="Calibri" w:eastAsia="Calibri" w:hAnsi="Calibri"/>
-          <w:color w:val="1B1F1F"/>
-          <w:sz w:val="21"/>
-          <w:szCs w:val="21"/>
-        </w:rPr>
-        <w:t xml:space="preserve">Blueprint mô tả </w:t>
-      </w:r>
-      <w:r>
-        <w:rPr>
-          <w:rFonts w:ascii="Calibri" w:cs="Calibri" w:eastAsia="Calibri" w:hAnsi="Calibri"/>
-          <w:b/>
-          <w:bCs/>
-          <w:color w:val="1B1F1F"/>
-          <w:sz w:val="21"/>
-          <w:szCs w:val="21"/>
-        </w:rPr>
-        <w:t xml:space="preserve">trách nhiệm và giao diện</w:t>
-      </w:r>
-      <w:r>
-        <w:rPr>
-          <w:rFonts w:ascii="Calibri" w:cs="Calibri" w:eastAsia="Calibri" w:hAnsi="Calibri"/>
-          <w:color w:val="1B1F1F"/>
-          <w:sz w:val="21"/>
-          <w:szCs w:val="21"/>
-        </w:rPr>
-        <w:t xml:space="preserve">, không mô tả cách hiện thực bên trong. Vẽ tới mức mã nguồn là lỗi thường gặp nhất ở buổi này.</w:t>
-      </w:r>
-    </w:p>
-    <w:p>
-      <w:pPr>
-        <w:pStyle w:val="Heading3"/>
-        <w:spacing w:after="90" w:before="180"/>
-      </w:pPr>
-      <w:r>
-        <w:rPr>
-          <w:rFonts w:ascii="Calibri" w:cs="Calibri" w:eastAsia="Calibri" w:hAnsi="Calibri"/>
-          <w:b/>
-          <w:bCs/>
-          <w:color w:val="1B1F1F"/>
-          <w:sz w:val="22"/>
-          <w:szCs w:val="22"/>
-        </w:rPr>
-        <w:t xml:space="preserve">Tối thiểu 5 ADR</w:t>
+          <w:b/>
+          <w:bCs/>
+          <w:color w:val="1B1F1F"/>
+          <w:sz w:val="21"/>
+          <w:szCs w:val="21"/>
+        </w:rPr>
+        <w:t xml:space="preserve">Sản phẩm:</w:t>
+      </w:r>
+      <w:r>
+        <w:rPr>
+          <w:rFonts w:ascii="Calibri" w:cs="Calibri" w:eastAsia="Calibri" w:hAnsi="Calibri"/>
+          <w:color w:val="1B1F1F"/>
+          <w:sz w:val="21"/>
+          <w:szCs w:val="21"/>
+        </w:rPr>
+        <w:t xml:space="preserve"> </w:t>
+      </w:r>
+      <w:r>
+        <w:rPr>
+          <w:rFonts w:ascii="Consolas" w:cs="Consolas" w:eastAsia="Consolas" w:hAnsi="Consolas"/>
+          <w:color w:val="0B3F41"/>
+          <w:sz w:val="20"/>
+          <w:szCs w:val="20"/>
+        </w:rPr>
+        <w:t xml:space="preserve">docs/blueprint.md</w:t>
+      </w:r>
+      <w:r>
+        <w:rPr>
+          <w:rFonts w:ascii="Calibri" w:cs="Calibri" w:eastAsia="Calibri" w:hAnsi="Calibri"/>
+          <w:color w:val="1B1F1F"/>
+          <w:sz w:val="21"/>
+          <w:szCs w:val="21"/>
+        </w:rPr>
+        <w:t xml:space="preserve">.</w:t>
+      </w:r>
+    </w:p>
+    <w:p>
+      <w:pPr>
+        <w:pBdr>
+          <w:bottom w:val="single" w:color="BFD3D2" w:sz="4" w:space="1"/>
+        </w:pBdr>
+        <w:spacing w:after="200" w:before="120"/>
+      </w:pPr>
+      <w:r>
+        <w:t xml:space="preserve"/>
+      </w:r>
+    </w:p>
+    <w:p>
+      <w:pPr>
+        <w:pStyle w:val="Heading2"/>
+        <w:spacing w:after="120" w:before="280"/>
+      </w:pPr>
+      <w:r>
+        <w:rPr>
+          <w:rFonts w:ascii="Calibri" w:cs="Calibri" w:eastAsia="Calibri" w:hAnsi="Calibri"/>
+          <w:b/>
+          <w:bCs/>
+          <w:color w:val="0B3F41"/>
+          <w:sz w:val="24"/>
+          <w:szCs w:val="24"/>
+        </w:rPr>
+        <w:t xml:space="preserve">Bước 5 — Ghi lại thành ADR (15 phút)</w:t>
       </w:r>
     </w:p>
     <w:p>
@@ -980,7 +1364,7 @@
           <w:sz w:val="21"/>
           <w:szCs w:val="21"/>
         </w:rPr>
-        <w:t xml:space="preserve">Mẫu bốn phần ở </w:t>
+        <w:t xml:space="preserve">Tối thiểu 5 ADR, lấy từ chính các quyết định vừa đưa ra ở Bước 2–4 (mức Workflow/Agent, ranh giới cho tool, chọn model, số lượng model, pattern). Mẫu bốn phần ở </w:t>
       </w:r>
       <w:r>
         <w:rPr>
@@ -1092,6 +1476,82 @@
     <w:p>
       <w:pPr>
         <w:pBdr>
+          <w:top w:val="single" w:color="FCEBE9" w:sz="2" w:space="4"/>
+          <w:bottom w:val="single" w:color="FCEBE9" w:sz="2" w:space="4"/>
+          <w:left w:val="single" w:color="B3261E" w:sz="24" w:space="8"/>
+          <w:right w:val="single" w:color="FCEBE9" w:sz="2" w:space="4"/>
+        </w:pBdr>
+        <w:shd w:fill="FCEBE9" w:val="clear"/>
+        <w:spacing w:after="200" w:before="100" w:line="300"/>
+        <w:ind w:left="100"/>
+      </w:pPr>
+      <w:r>
+        <w:rPr>
+          <w:rFonts w:ascii="Calibri" w:cs="Calibri" w:eastAsia="Calibri" w:hAnsi="Calibri"/>
+          <w:b/>
+          <w:bCs/>
+          <w:color w:val="B3261E"/>
+          <w:sz w:val="20"/>
+          <w:szCs w:val="20"/>
+        </w:rPr>
+        <w:t xml:space="preserve">⚠  </w:t>
+      </w:r>
+      <w:r>
+        <w:rPr>
+          <w:rFonts w:ascii="Calibri" w:cs="Calibri" w:eastAsia="Calibri" w:hAnsi="Calibri"/>
+          <w:b/>
+          <w:bCs/>
+          <w:color w:val="1B1F1F"/>
+          <w:sz w:val="20"/>
+          <w:szCs w:val="20"/>
+        </w:rPr>
+        <w:t xml:space="preserve">Một ADR chỉ ghi "đã chọn gì" mà không ghi phương án đã loại và lý do loại thì không phải ADR</w:t>
+      </w:r>
+      <w:r>
+        <w:rPr>
+          <w:rFonts w:ascii="Calibri" w:cs="Calibri" w:eastAsia="Calibri" w:hAnsi="Calibri"/>
+          <w:color w:val="1B1F1F"/>
+          <w:sz w:val="20"/>
+          <w:szCs w:val="20"/>
+        </w:rPr>
+        <w:t xml:space="preserve">, và không dùng để bảo vệ ở buổi cuối được.</w:t>
+      </w:r>
+    </w:p>
+    <w:p>
+      <w:pPr>
+        <w:spacing w:after="140" w:line="300"/>
+      </w:pPr>
+      <w:r>
+        <w:rPr>
+          <w:rFonts w:ascii="Calibri" w:cs="Calibri" w:eastAsia="Calibri" w:hAnsi="Calibri"/>
+          <w:color w:val="1B1F1F"/>
+          <w:sz w:val="21"/>
+          <w:szCs w:val="21"/>
+        </w:rPr>
+        <w:t xml:space="preserve">Năm ADR mẫu có sẵn trong </w:t>
+      </w:r>
+      <w:r>
+        <w:rPr>
+          <w:rFonts w:ascii="Consolas" w:cs="Consolas" w:eastAsia="Consolas" w:hAnsi="Consolas"/>
+          <w:color w:val="0B3F41"/>
+          <w:sz w:val="20"/>
+          <w:szCs w:val="20"/>
+        </w:rPr>
+        <w:t xml:space="preserve">docs/adr/</w:t>
+      </w:r>
+      <w:r>
+        <w:rPr>
+          <w:rFonts w:ascii="Calibri" w:cs="Calibri" w:eastAsia="Calibri" w:hAnsi="Calibri"/>
+          <w:color w:val="1B1F1F"/>
+          <w:sz w:val="21"/>
+          <w:szCs w:val="21"/>
+        </w:rPr>
+        <w:t xml:space="preserve"> để tham khảo cách viết. Nhóm phải tự viết ADR cho quyết định của mình, không sao chép.</w:t>
+      </w:r>
+    </w:p>
+    <w:p>
+      <w:pPr>
+        <w:pBdr>
           <w:top w:val="single" w:color="FBF2E1" w:sz="2" w:space="4"/>
           <w:bottom w:val="single" w:color="FBF2E1" w:sz="2" w:space="4"/>
           <w:left w:val="single" w:color="B8860B" w:sz="24" w:space="8"/>
@@ -1112,7 +1572,7 @@
           <w:sz w:val="20"/>
           <w:szCs w:val="20"/>
         </w:rPr>
-        <w:t xml:space="preserve">Một ADR chỉ ghi "đã chọn gì" mà không ghi phương án đã loại và lý do loại thì không phải ADR</w:t>
+        <w:t xml:space="preserve">Bảng quyết định thiết kế ở Bước 5 chính là tài liệu dùng để phản biện ở Session 6.</w:t>
       </w:r>
       <w:r>
         <w:rPr>
@@ -1123,7 +1583,7 @@
           <w:sz w:val="20"/>
           <w:szCs w:val="20"/>
         </w:rPr>
-        <w:t xml:space="preserve">, và không dùng để bảo vệ ở buổi cuối được.</w:t>
+        <w:t xml:space="preserve"> Ghi chép nghiêm túc từ bây giờ thay vì cố nhớ lại vào ngày cuối. Phần bảo vệ quyết định thiết kế chiếm 1,5/10 điểm cuối khóa.</w:t>
       </w:r>
     </w:p>
     <w:p>
@@ -1133,38 +1593,6 @@
       <w:r>
         <w:rPr>
           <w:rFonts w:ascii="Calibri" w:cs="Calibri" w:eastAsia="Calibri" w:hAnsi="Calibri"/>
-          <w:color w:val="1B1F1F"/>
-          <w:sz w:val="21"/>
-          <w:szCs w:val="21"/>
-        </w:rPr>
-        <w:t xml:space="preserve">Năm ADR mẫu có sẵn trong </w:t>
-      </w:r>
-      <w:r>
-        <w:rPr>
-          <w:rFonts w:ascii="Consolas" w:cs="Consolas" w:eastAsia="Consolas" w:hAnsi="Consolas"/>
-          <w:color w:val="0B3F41"/>
-          <w:sz w:val="20"/>
-          <w:szCs w:val="20"/>
-        </w:rPr>
-        <w:t xml:space="preserve">docs/adr/</w:t>
-      </w:r>
-      <w:r>
-        <w:rPr>
-          <w:rFonts w:ascii="Calibri" w:cs="Calibri" w:eastAsia="Calibri" w:hAnsi="Calibri"/>
-          <w:color w:val="1B1F1F"/>
-          <w:sz w:val="21"/>
-          <w:szCs w:val="21"/>
-        </w:rPr>
-        <w:t xml:space="preserve"> để tham khảo cách viết. Nhóm phải tự viết ADR cho quyết định của mình, không sao chép.</w:t>
-      </w:r>
-    </w:p>
-    <w:p>
-      <w:pPr>
-        <w:spacing w:after="140" w:line="300"/>
-      </w:pPr>
-      <w:r>
-        <w:rPr>
-          <w:rFonts w:ascii="Calibri" w:cs="Calibri" w:eastAsia="Calibri" w:hAnsi="Calibri"/>
           <w:b/>
           <w:bCs/>
           <w:color w:val="1B1F1F"/>
@@ -1180,7 +1608,7 @@
           <w:sz w:val="21"/>
           <w:szCs w:val="21"/>
         </w:rPr>
-        <w:t xml:space="preserve"> Blueprint và 5 ADR.</w:t>
+        <w:t xml:space="preserve"> 5 ADR.</w:t>
       </w:r>
     </w:p>
     <w:p>
@@ -1208,7 +1636,7 @@
           <w:sz w:val="24"/>
           <w:szCs w:val="24"/>
         </w:rPr>
-        <w:t xml:space="preserve">Bước 4 — Nối dây và kích hoạt quy trình kỹ thuật (25 phút)</w:t>
+        <w:t xml:space="preserve">Bước 6 — Nối dây và kích hoạt quy trình kỹ thuật (15 phút)</w:t>
       </w:r>
     </w:p>
     <w:p>
@@ -1224,7 +1652,16 @@
           <w:sz w:val="21"/>
           <w:szCs w:val="21"/>
         </w:rPr>
-        <w:t xml:space="preserve">1. Kiểm chứng chuyển đổi cấu hình chỉ bằng biến môi trường:</w:t>
+        <w:t xml:space="preserve">1. Kiểm chứng chuyển đổi cấu hình chỉ bằng biến môi trường</w:t>
+      </w:r>
+      <w:r>
+        <w:rPr>
+          <w:rFonts w:ascii="Calibri" w:cs="Calibri" w:eastAsia="Calibri" w:hAnsi="Calibri"/>
+          <w:color w:val="1B1F1F"/>
+          <w:sz w:val="21"/>
+          <w:szCs w:val="21"/>
+        </w:rPr>
+        <w:t xml:space="preserve"> — không sửa một dòng mã nào:</w:t>
       </w:r>
     </w:p>
     <w:p>
@@ -1278,27 +1715,22 @@
       <w:r>
         <w:rPr>
           <w:rFonts w:ascii="Calibri" w:cs="Calibri" w:eastAsia="Calibri" w:hAnsi="Calibri"/>
-          <w:color w:val="1B1F1F"/>
-          <w:sz w:val="21"/>
-          <w:szCs w:val="21"/>
-        </w:rPr>
-        <w:t xml:space="preserve">Không sửa một dòng mã nào.</w:t>
-      </w:r>
-    </w:p>
-    <w:p>
-      <w:pPr>
-        <w:spacing w:after="140" w:line="300"/>
-      </w:pPr>
-      <w:r>
-        <w:rPr>
-          <w:rFonts w:ascii="Calibri" w:cs="Calibri" w:eastAsia="Calibri" w:hAnsi="Calibri"/>
-          <w:b/>
-          <w:bCs/>
-          <w:color w:val="1B1F1F"/>
-          <w:sz w:val="21"/>
-          <w:szCs w:val="21"/>
-        </w:rPr>
-        <w:t xml:space="preserve">2. Đẩy mã lên nhánh nhóm và quan sát CI:</w:t>
+          <w:b/>
+          <w:bCs/>
+          <w:color w:val="1B1F1F"/>
+          <w:sz w:val="21"/>
+          <w:szCs w:val="21"/>
+        </w:rPr>
+        <w:t xml:space="preserve">2. Đẩy mã lên nhánh nhóm và quan sát CI.</w:t>
+      </w:r>
+      <w:r>
+        <w:rPr>
+          <w:rFonts w:ascii="Calibri" w:cs="Calibri" w:eastAsia="Calibri" w:hAnsi="Calibri"/>
+          <w:color w:val="1B1F1F"/>
+          <w:sz w:val="21"/>
+          <w:szCs w:val="21"/>
+        </w:rPr>
+        <w:t xml:space="preserve"> Giai đoạn 1 (kiểm tra mã) chạy lần đầu. Xem nó xanh hay đỏ, và vì sao.</w:t>
       </w:r>
     </w:p>
     <w:p>
@@ -1374,27 +1806,13 @@
       <w:r>
         <w:rPr>
           <w:rFonts w:ascii="Calibri" w:cs="Calibri" w:eastAsia="Calibri" w:hAnsi="Calibri"/>
-          <w:color w:val="1B1F1F"/>
-          <w:sz w:val="21"/>
-          <w:szCs w:val="21"/>
-        </w:rPr>
-        <w:t xml:space="preserve">Giai đoạn 1 (kiểm tra mã) chạy lần đầu. Xem nó xanh hay đỏ, và vì sao.</w:t>
-      </w:r>
-    </w:p>
-    <w:p>
-      <w:pPr>
-        <w:spacing w:after="140" w:line="300"/>
-      </w:pPr>
-      <w:r>
-        <w:rPr>
-          <w:rFonts w:ascii="Calibri" w:cs="Calibri" w:eastAsia="Calibri" w:hAnsi="Calibri"/>
-          <w:b/>
-          <w:bCs/>
-          <w:color w:val="1B1F1F"/>
-          <w:sz w:val="21"/>
-          <w:szCs w:val="21"/>
-        </w:rPr>
-        <w:t xml:space="preserve">3. Khởi động toàn bộ dịch vụ, gửi thử một ticket:</w:t>
+          <w:b/>
+          <w:bCs/>
+          <w:color w:val="1B1F1F"/>
+          <w:sz w:val="21"/>
+          <w:szCs w:val="21"/>
+        </w:rPr>
+        <w:t xml:space="preserve">3. Khởi động giao diện, gửi thử một ticket:</w:t>
       </w:r>
     </w:p>
     <w:p>
@@ -1497,7 +1915,7 @@
           <w:sz w:val="21"/>
           <w:szCs w:val="21"/>
         </w:rPr>
-        <w:t xml:space="preserve"> — sơ đồ 5 tầng và mô tả từng thành phần</w:t>
+        <w:t xml:space="preserve"> — sơ đồ năm tầng, bảy mục và phương án dự phòng của từng thành phần</w:t>
       </w:r>
     </w:p>
     <w:p>
@@ -1646,7 +2064,7 @@
     </w:p>
     <w:tbl>
       <w:tblPr>
-        <w:tblW w:type="dxa" w:w="9700"/>
+        <w:tblW w:type="dxa" w:w="9200"/>
         <w:tblBorders>
           <w:top w:val="single" w:color="BFD3D2" w:sz="4"/>
           <w:left w:val="single" w:color="BFD3D2" w:sz="4"/>
@@ -1657,8 +2075,8 @@
         </w:tblBorders>
       </w:tblPr>
       <w:tblGrid>
-        <w:gridCol w:w="8300"/>
-        <w:gridCol w:w="1400"/>
+        <w:gridCol w:w="8000"/>
+        <w:gridCol w:w="1200"/>
       </w:tblGrid>
       <w:tr>
         <w:trPr>
@@ -1666,7 +2084,7 @@
         </w:trPr>
         <w:tc>
           <w:tcPr>
-            <w:tcW w:type="dxa" w:w="8300"/>
+            <w:tcW w:type="dxa" w:w="8000"/>
             <w:shd w:fill="DCEBEA" w:val="clear"/>
             <w:tcMar>
               <w:top w:type="dxa" w:w="80"/>
@@ -1692,7 +2110,7 @@
         </w:tc>
         <w:tc>
           <w:tcPr>
-            <w:tcW w:type="dxa" w:w="1400"/>
+            <w:tcW w:type="dxa" w:w="1200"/>
             <w:shd w:fill="DCEBEA" w:val="clear"/>
             <w:tcMar>
               <w:top w:type="dxa" w:w="80"/>
@@ -1723,7 +2141,7 @@
         </w:trPr>
         <w:tc>
           <w:tcPr>
-            <w:tcW w:type="dxa" w:w="8300"/>
+            <w:tcW w:type="dxa" w:w="8000"/>
             <w:tcMar>
               <w:top w:type="dxa" w:w="80"/>
               <w:left w:type="dxa" w:w="100"/>
@@ -1742,13 +2160,13 @@
                 <w:sz w:val="20"/>
                 <w:szCs w:val="20"/>
               </w:rPr>
-              <w:t xml:space="preserve">Sơ đồ kiến trúc đủ 5 tầng, rõ trách nhiệm</w:t>
+              <w:t xml:space="preserve">Sơ đồ kiến trúc đủ năm tầng theo slide 10, rõ trách nhiệm và ranh giới</w:t>
             </w:r>
           </w:p>
         </w:tc>
         <w:tc>
           <w:tcPr>
-            <w:tcW w:type="dxa" w:w="1400"/>
+            <w:tcW w:type="dxa" w:w="1200"/>
             <w:tcMar>
               <w:top w:type="dxa" w:w="80"/>
               <w:left w:type="dxa" w:w="100"/>
@@ -1778,7 +2196,7 @@
         </w:trPr>
         <w:tc>
           <w:tcPr>
-            <w:tcW w:type="dxa" w:w="8300"/>
+            <w:tcW w:type="dxa" w:w="8000"/>
             <w:shd w:fill="F2F7F6" w:val="clear"/>
             <w:tcMar>
               <w:top w:type="dxa" w:w="80"/>
@@ -1798,13 +2216,13 @@
                 <w:sz w:val="20"/>
                 <w:szCs w:val="20"/>
               </w:rPr>
-              <w:t xml:space="preserve">Mỗi thành phần có phương án dự phòng</w:t>
+              <w:t xml:space="preserve">Mỗi thành phần có phương án dự phòng; Blueprint đủ bảy mục</w:t>
             </w:r>
           </w:p>
         </w:tc>
         <w:tc>
           <w:tcPr>
-            <w:tcW w:type="dxa" w:w="1400"/>
+            <w:tcW w:type="dxa" w:w="1200"/>
             <w:shd w:fill="F2F7F6" w:val="clear"/>
             <w:tcMar>
               <w:top w:type="dxa" w:w="80"/>
@@ -1835,7 +2253,7 @@
         </w:trPr>
         <w:tc>
           <w:tcPr>
-            <w:tcW w:type="dxa" w:w="8300"/>
+            <w:tcW w:type="dxa" w:w="8000"/>
             <w:tcMar>
               <w:top w:type="dxa" w:w="80"/>
               <w:left w:type="dxa" w:w="100"/>
@@ -1860,7 +2278,7 @@
         </w:tc>
         <w:tc>
           <w:tcPr>
-            <w:tcW w:type="dxa" w:w="1400"/>
+            <w:tcW w:type="dxa" w:w="1200"/>
             <w:tcMar>
               <w:top w:type="dxa" w:w="80"/>
               <w:left w:type="dxa" w:w="100"/>
@@ -1890,7 +2308,7 @@
         </w:trPr>
         <w:tc>
           <w:tcPr>
-            <w:tcW w:type="dxa" w:w="8300"/>
+            <w:tcW w:type="dxa" w:w="8000"/>
             <w:shd w:fill="F2F7F6" w:val="clear"/>
             <w:tcMar>
               <w:top w:type="dxa" w:w="80"/>
@@ -1916,7 +2334,7 @@
         </w:tc>
         <w:tc>
           <w:tcPr>
-            <w:tcW w:type="dxa" w:w="1400"/>
+            <w:tcW w:type="dxa" w:w="1200"/>
             <w:shd w:fill="F2F7F6" w:val="clear"/>
             <w:tcMar>
               <w:top w:type="dxa" w:w="80"/>
@@ -1944,6 +2362,11 @@
     </w:tbl>
     <w:p>
       <w:pPr>
+        <w:spacing w:after="120"/>
+      </w:pPr>
+    </w:p>
+    <w:p>
+      <w:pPr>
         <w:pStyle w:val="Heading2"/>
         <w:spacing w:after="120" w:before="280"/>
       </w:pPr>
@@ -1961,64 +2384,40 @@
     </w:p>
     <w:p>
       <w:pPr>
-        <w:spacing w:after="140" w:line="300"/>
-      </w:pPr>
-      <w:r>
-        <w:rPr>
-          <w:rFonts w:ascii="Calibri" w:cs="Calibri" w:eastAsia="Calibri" w:hAnsi="Calibri"/>
-          <w:color w:val="1B1F1F"/>
-          <w:sz w:val="21"/>
-          <w:szCs w:val="21"/>
-        </w:rPr>
-        <w:t xml:space="preserve">Vẽ thêm sơ đồ tuần tự cho luồng xử lý một ticket có gọi công cụ — dự đoán trước cấu trúc sẽ xây ở Session 4.</w:t>
-      </w:r>
-    </w:p>
-    <w:p>
-      <w:pPr>
-        <w:pBdr>
-          <w:bottom w:val="single" w:color="BFD3D2" w:sz="4" w:space="1"/>
-        </w:pBdr>
-        <w:spacing w:after="200" w:before="120"/>
-      </w:pPr>
-      <w:r>
-        <w:t xml:space="preserve"/>
-      </w:r>
-    </w:p>
-    <w:p>
-      <w:pPr>
-        <w:pBdr>
-          <w:top w:val="single" w:color="FBF2E1" w:sz="2" w:space="4"/>
-          <w:bottom w:val="single" w:color="FBF2E1" w:sz="2" w:space="4"/>
-          <w:left w:val="single" w:color="B8860B" w:sz="24" w:space="8"/>
-          <w:right w:val="single" w:color="FBF2E1" w:sz="2" w:space="4"/>
-        </w:pBdr>
-        <w:shd w:fill="FBF2E1" w:val="clear"/>
-        <w:spacing w:after="200" w:before="100" w:line="300"/>
-        <w:ind w:left="100"/>
-      </w:pPr>
-      <w:r>
-        <w:rPr>
-          <w:rFonts w:ascii="Calibri" w:cs="Calibri" w:eastAsia="Calibri" w:hAnsi="Calibri"/>
-          <w:b/>
-          <w:bCs/>
-          <w:i/>
-          <w:iCs/>
-          <w:color w:val="1B1F1F"/>
-          <w:sz w:val="20"/>
-          <w:szCs w:val="20"/>
-        </w:rPr>
-        <w:t xml:space="preserve">Bảng quyết định thiết kế ở bước 3 chính là tài liệu dùng để phản biện ở Session 6.</w:t>
-      </w:r>
-      <w:r>
-        <w:rPr>
-          <w:rFonts w:ascii="Calibri" w:cs="Calibri" w:eastAsia="Calibri" w:hAnsi="Calibri"/>
-          <w:i/>
-          <w:iCs/>
-          <w:color w:val="1B1F1F"/>
-          <w:sz w:val="20"/>
-          <w:szCs w:val="20"/>
-        </w:rPr>
-        <w:t xml:space="preserve"> Ghi chép nghiêm túc từ bây giờ thay vì cố nhớ lại vào ngày cuối. Phần bảo vệ quyết định thiết kế chiếm 1,5/10 điểm cuối khóa.</w:t>
+        <w:pStyle w:val="ListParagraph"/>
+        <w:numPr>
+          <w:ilvl w:val="0"/>
+          <w:numId w:val="2"/>
+        </w:numPr>
+        <w:spacing w:after="70" w:line="300"/>
+      </w:pPr>
+      <w:r>
+        <w:rPr>
+          <w:rFonts w:ascii="Calibri" w:cs="Calibri" w:eastAsia="Calibri" w:hAnsi="Calibri"/>
+          <w:color w:val="1B1F1F"/>
+          <w:sz w:val="21"/>
+          <w:szCs w:val="21"/>
+        </w:rPr>
+        <w:t xml:space="preserve">Với mỗi mảng Governance ở slide 27 (Policy, Risk, Model, Change, Compliance &amp; Audit), chỉ ra hệ thống hiện có gì hoặc ghi "chưa có".</w:t>
+      </w:r>
+    </w:p>
+    <w:p>
+      <w:pPr>
+        <w:pStyle w:val="ListParagraph"/>
+        <w:numPr>
+          <w:ilvl w:val="0"/>
+          <w:numId w:val="2"/>
+        </w:numPr>
+        <w:spacing w:after="70" w:line="300"/>
+      </w:pPr>
+      <w:r>
+        <w:rPr>
+          <w:rFonts w:ascii="Calibri" w:cs="Calibri" w:eastAsia="Calibri" w:hAnsi="Calibri"/>
+          <w:color w:val="1B1F1F"/>
+          <w:sz w:val="21"/>
+          <w:szCs w:val="21"/>
+        </w:rPr>
+        <w:t xml:space="preserve">Vẽ sơ đồ tuần tự cho luồng xử lý một ticket có gọi công cụ — dự đoán trước cấu trúc sẽ xây ở Session 4.</w:t>
       </w:r>
     </w:p>
     <w:sectPr>
@@ -2175,7 +2574,7 @@
         <w:sz w:val="16"/>
         <w:szCs w:val="16"/>
       </w:rPr>
-      <w:t xml:space="preserve">AI-Native Application Engineering  ·  Đề bài Lab 2</w:t>
+      <w:t xml:space="preserve">AI-Native Application Engineering  ·  Lab 2 — Session 2</w:t>
     </w:r>
   </w:p>
 </w:hdr>

</xml_diff>

<commit_message>
Buổi 2 — Workbook viết lại cho người ít code, thêm khung Blueprint và thí nghiệm nhiệt độ
- Workbook 2 (23 trang): mỗi câu chỉ hai nơi tìm đáp án (tài liệu hoặc mã),
  25 câu phân tích ba phần (dẫn chứng · vì sao · nếu khác đi thì), kèm bốn
  phụ lục: cách đọc mã, từ điển thuật ngữ, bản đồ dự án, sổ tay lệnh
- Lab 2 đồng bộ với workbook, thang điểm chuyển sang chất lượng phân tích
- docs/blueprint-template.md: khung Blueprint chín mục để sao chép thành
  docs/blueprint.md
- scripts/temperature_demo.py: thí nghiệm nhiệt độ chạy được ở Session 2,
  tự tắt cache, không cần mã của Lab 3–4

Không kèm đáp án của giảng viên.

Co-Authored-By: Claude Sonnet 5 <noreply@anthropic.com>
</commit_message>
<xml_diff>
--- a/tai-lieu-hoc-vien/labs/LAB-2.docx
+++ b/tai-lieu-hoc-vien/labs/LAB-2.docx
@@ -38,7 +38,7 @@
           <w:sz w:val="22"/>
           <w:szCs w:val="22"/>
         </w:rPr>
-        <w:t xml:space="preserve">Session 2 · Ngày 1, buổi chiều · 120 phút thực hành</w:t>
+        <w:t xml:space="preserve">Session 2 · Ngày 1, buổi chiều · 120 phút</w:t>
       </w:r>
     </w:p>
     <w:p>
@@ -118,6 +118,7 @@
     <w:p>
       <w:pPr>
         <w:pStyle w:val="Heading1"/>
+        <w:keepNext/>
         <w:pBdr>
           <w:bottom w:val="single" w:color="0F5257" w:sz="6" w:space="4"/>
         </w:pBdr>
@@ -148,7 +149,27 @@
           <w:sz w:val="21"/>
           <w:szCs w:val="21"/>
         </w:rPr>
-        <w:t xml:space="preserve">Session 2 · Ngày 1, buổi chiều · 120 phút thực hành · Deliverable: docs/blueprint.md + 5 ADR</w:t>
+        <w:t xml:space="preserve">Session 2 · Ngày 1, buổi chiều · 120 phút · Deliverable: </w:t>
+      </w:r>
+      <w:r>
+        <w:rPr>
+          <w:rFonts w:ascii="Consolas" w:cs="Consolas" w:eastAsia="Consolas" w:hAnsi="Consolas"/>
+          <w:color w:val="0B3F41"/>
+          <w:sz w:val="20"/>
+          <w:szCs w:val="20"/>
+        </w:rPr>
+        <w:t xml:space="preserve">docs/blueprint.md</w:t>
+      </w:r>
+      <w:r>
+        <w:rPr>
+          <w:rFonts w:ascii="Calibri" w:cs="Calibri" w:eastAsia="Calibri" w:hAnsi="Calibri"/>
+          <w:b/>
+          <w:bCs/>
+          <w:color w:val="1B1F1F"/>
+          <w:sz w:val="21"/>
+          <w:szCs w:val="21"/>
+        </w:rPr>
+        <w:t xml:space="preserve"> + 5 ADR</w:t>
       </w:r>
     </w:p>
     <w:p>
@@ -284,7 +305,7 @@
           <w:sz w:val="20"/>
           <w:szCs w:val="20"/>
         </w:rPr>
-        <w:t xml:space="preserve">đã đo được gì và vì sao chọn như vậy</w:t>
+        <w:t xml:space="preserve">đã đọc được gì, phân tích ra sao và vì sao chọn như vậy</w:t>
       </w:r>
       <w:r>
         <w:rPr>
@@ -319,13 +340,48 @@
       <w:r>
         <w:rPr>
           <w:rFonts w:ascii="Calibri" w:cs="Calibri" w:eastAsia="Calibri" w:hAnsi="Calibri"/>
+          <w:b/>
+          <w:bCs/>
           <w:i/>
           <w:iCs/>
           <w:color w:val="1B1F1F"/>
           <w:sz w:val="20"/>
           <w:szCs w:val="20"/>
         </w:rPr>
-        <w:t xml:space="preserve">Bài này đi theo slide Session 2. Workbook ghi số slide ở từng bước — mở slide song song khi làm.</w:t>
+        <w:t xml:space="preserve">Buổi này không viết code mới.</w:t>
+      </w:r>
+      <w:r>
+        <w:rPr>
+          <w:rFonts w:ascii="Calibri" w:cs="Calibri" w:eastAsia="Calibri" w:hAnsi="Calibri"/>
+          <w:i/>
+          <w:iCs/>
+          <w:color w:val="1B1F1F"/>
+          <w:sz w:val="20"/>
+          <w:szCs w:val="20"/>
+        </w:rPr>
+        <w:t xml:space="preserve"> Bạn đóng vai kiến trúc sư: đọc tài liệu (</w:t>
+      </w:r>
+      <w:r>
+        <w:rPr>
+          <w:rFonts w:ascii="Consolas" w:cs="Consolas" w:eastAsia="Consolas" w:hAnsi="Consolas"/>
+          <w:i/>
+          <w:iCs/>
+          <w:color w:val="0B3F41"/>
+          <w:sz w:val="19"/>
+          <w:szCs w:val="19"/>
+        </w:rPr>
+        <w:t xml:space="preserve">PROJECT-SPEC.md</w:t>
+      </w:r>
+      <w:r>
+        <w:rPr>
+          <w:rFonts w:ascii="Calibri" w:cs="Calibri" w:eastAsia="Calibri" w:hAnsi="Calibri"/>
+          <w:i/>
+          <w:iCs/>
+          <w:color w:val="1B1F1F"/>
+          <w:sz w:val="20"/>
+          <w:szCs w:val="20"/>
+        </w:rPr>
+        <w:t xml:space="preserve">, ADR) hoặc đọc mô tả trong mã, rồi ghi lại quyết định thiết kế. Không cần biết lập trình; workbook có phụ lục hướng dẫn cách đọc mã, từ điển thuật ngữ và sổ tay lệnh. Bài đi theo slide Session 2 — workbook ghi số slide ở từng bước.</w:t>
       </w:r>
     </w:p>
     <w:p>
@@ -342,6 +398,7 @@
     <w:p>
       <w:pPr>
         <w:pStyle w:val="Heading2"/>
+        <w:keepNext/>
         <w:spacing w:after="120" w:before="280"/>
       </w:pPr>
       <w:r>
@@ -353,41 +410,7 @@
           <w:sz w:val="24"/>
           <w:szCs w:val="24"/>
         </w:rPr>
-        <w:t xml:space="preserve">Bước 1 — Phân rã: các thành phần của một ứng dụng AI (20 phút)</w:t>
-      </w:r>
-    </w:p>
-    <w:p>
-      <w:pPr>
-        <w:spacing w:after="140" w:line="300"/>
-      </w:pPr>
-      <w:r>
-        <w:rPr>
-          <w:rFonts w:ascii="Calibri" w:cs="Calibri" w:eastAsia="Calibri" w:hAnsi="Calibri"/>
-          <w:color w:val="1B1F1F"/>
-          <w:sz w:val="21"/>
-          <w:szCs w:val="21"/>
-        </w:rPr>
-        <w:t xml:space="preserve">Khám phá repo và </w:t>
-      </w:r>
-      <w:r>
-        <w:rPr>
-          <w:rFonts w:ascii="Calibri" w:cs="Calibri" w:eastAsia="Calibri" w:hAnsi="Calibri"/>
-          <w:b/>
-          <w:bCs/>
-          <w:color w:val="1B1F1F"/>
-          <w:sz w:val="21"/>
-          <w:szCs w:val="21"/>
-        </w:rPr>
-        <w:t xml:space="preserve">trả lời bằng văn bản</w:t>
-      </w:r>
-      <w:r>
-        <w:rPr>
-          <w:rFonts w:ascii="Calibri" w:cs="Calibri" w:eastAsia="Calibri" w:hAnsi="Calibri"/>
-          <w:color w:val="1B1F1F"/>
-          <w:sz w:val="21"/>
-          <w:szCs w:val="21"/>
-        </w:rPr>
-        <w:t xml:space="preserve">:</w:t>
+        <w:t xml:space="preserve">Bước 1 — Đọc để hiểu: hệ thống được ghép từ những gì? (20 phút)</w:t>
       </w:r>
     </w:p>
     <w:p>
@@ -410,11 +433,76 @@
       <w:r>
         <w:rPr>
           <w:rFonts w:ascii="Calibri" w:cs="Calibri" w:eastAsia="Calibri" w:hAnsi="Calibri"/>
-          <w:color w:val="1B1F1F"/>
-          <w:sz w:val="21"/>
-          <w:szCs w:val="21"/>
-        </w:rPr>
-        <w:t xml:space="preserve">Khi người dùng gửi một ticket, dữ liệu đi từ đâu tới đâu? Liệt kê theo thứ tự các tệp nó đi qua.</w:t>
+          <w:b/>
+          <w:bCs/>
+          <w:color w:val="1B1F1F"/>
+          <w:sz w:val="21"/>
+          <w:szCs w:val="21"/>
+        </w:rPr>
+        <w:t xml:space="preserve">Hành trình một ticket:</w:t>
+      </w:r>
+      <w:r>
+        <w:rPr>
+          <w:rFonts w:ascii="Calibri" w:cs="Calibri" w:eastAsia="Calibri" w:hAnsi="Calibri"/>
+          <w:color w:val="1B1F1F"/>
+          <w:sz w:val="21"/>
+          <w:szCs w:val="21"/>
+        </w:rPr>
+        <w:t xml:space="preserve"> đọc sơ đồ </w:t>
+      </w:r>
+      <w:r>
+        <w:rPr>
+          <w:rFonts w:ascii="Consolas" w:cs="Consolas" w:eastAsia="Consolas" w:hAnsi="Consolas"/>
+          <w:color w:val="0B3F41"/>
+          <w:sz w:val="20"/>
+          <w:szCs w:val="20"/>
+        </w:rPr>
+        <w:t xml:space="preserve">SPEC-FLOW-01</w:t>
+      </w:r>
+      <w:r>
+        <w:rPr>
+          <w:rFonts w:ascii="Calibri" w:cs="Calibri" w:eastAsia="Calibri" w:hAnsi="Calibri"/>
+          <w:color w:val="1B1F1F"/>
+          <w:sz w:val="21"/>
+          <w:szCs w:val="21"/>
+        </w:rPr>
+        <w:t xml:space="preserve"> (hoặc mô tả hàm </w:t>
+      </w:r>
+      <w:r>
+        <w:rPr>
+          <w:rFonts w:ascii="Consolas" w:cs="Consolas" w:eastAsia="Consolas" w:hAnsi="Consolas"/>
+          <w:color w:val="0B3F41"/>
+          <w:sz w:val="20"/>
+          <w:szCs w:val="20"/>
+        </w:rPr>
+        <w:t xml:space="preserve">process_ticket</w:t>
+      </w:r>
+      <w:r>
+        <w:rPr>
+          <w:rFonts w:ascii="Calibri" w:cs="Calibri" w:eastAsia="Calibri" w:hAnsi="Calibri"/>
+          <w:color w:val="1B1F1F"/>
+          <w:sz w:val="21"/>
+          <w:szCs w:val="21"/>
+        </w:rPr>
+        <w:t xml:space="preserve"> trong </w:t>
+      </w:r>
+      <w:r>
+        <w:rPr>
+          <w:rFonts w:ascii="Consolas" w:cs="Consolas" w:eastAsia="Consolas" w:hAnsi="Consolas"/>
+          <w:color w:val="0B3F41"/>
+          <w:sz w:val="20"/>
+          <w:szCs w:val="20"/>
+        </w:rPr>
+        <w:t xml:space="preserve">src/agent/workflow.py</w:t>
+      </w:r>
+      <w:r>
+        <w:rPr>
+          <w:rFonts w:ascii="Calibri" w:cs="Calibri" w:eastAsia="Calibri" w:hAnsi="Calibri"/>
+          <w:color w:val="1B1F1F"/>
+          <w:sz w:val="21"/>
+          <w:szCs w:val="21"/>
+        </w:rPr>
+        <w:t xml:space="preserve">) và liệt kê các bước theo thứ tự, mỗi bước kèm tệp đảm nhận và nơi ticket đi tiếp khi bước đó lỗi hoặc không chắc.</w:t>
       </w:r>
     </w:p>
     <w:p>
@@ -437,11 +525,60 @@
       <w:r>
         <w:rPr>
           <w:rFonts w:ascii="Calibri" w:cs="Calibri" w:eastAsia="Calibri" w:hAnsi="Calibri"/>
-          <w:color w:val="1B1F1F"/>
-          <w:sz w:val="21"/>
-          <w:szCs w:val="21"/>
-        </w:rPr>
-        <w:t xml:space="preserve">Slide 10 chia ứng dụng AI thành năm tầng (Experience, Orchestration, Intelligence, Context &amp; Knowledge, Tools &amp; Enterprise Systems) cùng hai thành phần xuyên suốt (Security &amp; Guardrails, AI Platform &amp; Operations). Mỗi thành phần đó nằm ở tệp nào trong repo, và chịu trách nhiệm gì?</w:t>
+          <w:b/>
+          <w:bCs/>
+          <w:color w:val="1B1F1F"/>
+          <w:sz w:val="21"/>
+          <w:szCs w:val="21"/>
+        </w:rPr>
+        <w:t xml:space="preserve">Ghép slide với dự án:</w:t>
+      </w:r>
+      <w:r>
+        <w:rPr>
+          <w:rFonts w:ascii="Calibri" w:cs="Calibri" w:eastAsia="Calibri" w:hAnsi="Calibri"/>
+          <w:color w:val="1B1F1F"/>
+          <w:sz w:val="21"/>
+          <w:szCs w:val="21"/>
+        </w:rPr>
+        <w:t xml:space="preserve"> slide 10 chia ứng dụng AI thành năm tầng cùng hai thành phần xuyên suốt; </w:t>
+      </w:r>
+      <w:r>
+        <w:rPr>
+          <w:rFonts w:ascii="Consolas" w:cs="Consolas" w:eastAsia="Consolas" w:hAnsi="Consolas"/>
+          <w:color w:val="0B3F41"/>
+          <w:sz w:val="20"/>
+          <w:szCs w:val="20"/>
+        </w:rPr>
+        <w:t xml:space="preserve">SPEC-ARCH-01</w:t>
+      </w:r>
+      <w:r>
+        <w:rPr>
+          <w:rFonts w:ascii="Calibri" w:cs="Calibri" w:eastAsia="Calibri" w:hAnsi="Calibri"/>
+          <w:color w:val="1B1F1F"/>
+          <w:sz w:val="21"/>
+          <w:szCs w:val="21"/>
+        </w:rPr>
+        <w:t xml:space="preserve"> chia theo lớp phần mềm. Tìm tệp cho từng thành phần, nối hai cách chia với nhau, và nói </w:t>
+      </w:r>
+      <w:r>
+        <w:rPr>
+          <w:rFonts w:ascii="Calibri" w:cs="Calibri" w:eastAsia="Calibri" w:hAnsi="Calibri"/>
+          <w:i/>
+          <w:iCs/>
+          <w:color w:val="1B1F1F"/>
+          <w:sz w:val="21"/>
+          <w:szCs w:val="21"/>
+        </w:rPr>
+        <w:t xml:space="preserve">nếu bỏ thành phần đó thì chuyện gì xảy ra</w:t>
+      </w:r>
+      <w:r>
+        <w:rPr>
+          <w:rFonts w:ascii="Calibri" w:cs="Calibri" w:eastAsia="Calibri" w:hAnsi="Calibri"/>
+          <w:color w:val="1B1F1F"/>
+          <w:sz w:val="21"/>
+          <w:szCs w:val="21"/>
+        </w:rPr>
+        <w:t xml:space="preserve">.</w:t>
       </w:r>
     </w:p>
     <w:p>
@@ -470,16 +607,36 @@
           <w:sz w:val="21"/>
           <w:szCs w:val="21"/>
         </w:rPr>
-        <w:t xml:space="preserve">Lớp cache hoạt động theo cơ chế nào?</w:t>
-      </w:r>
-      <w:r>
-        <w:rPr>
-          <w:rFonts w:ascii="Calibri" w:cs="Calibri" w:eastAsia="Calibri" w:hAnsi="Calibri"/>
-          <w:color w:val="1B1F1F"/>
-          <w:sz w:val="21"/>
-          <w:szCs w:val="21"/>
-        </w:rPr>
-        <w:t xml:space="preserve"> Cụ thể: khóa cache gồm những gì, và vì sao?</w:t>
+        <w:t xml:space="preserve">Lớp cache:</w:t>
+      </w:r>
+      <w:r>
+        <w:rPr>
+          <w:rFonts w:ascii="Calibri" w:cs="Calibri" w:eastAsia="Calibri" w:hAnsi="Calibri"/>
+          <w:color w:val="1B1F1F"/>
+          <w:sz w:val="21"/>
+          <w:szCs w:val="21"/>
+        </w:rPr>
+        <w:t xml:space="preserve"> khóa cache gồm những gì, và vì sao </w:t>
+      </w:r>
+      <w:r>
+        <w:rPr>
+          <w:rFonts w:ascii="Calibri" w:cs="Calibri" w:eastAsia="Calibri" w:hAnsi="Calibri"/>
+          <w:b/>
+          <w:bCs/>
+          <w:color w:val="1B1F1F"/>
+          <w:sz w:val="21"/>
+          <w:szCs w:val="21"/>
+        </w:rPr>
+        <w:t xml:space="preserve">bắt buộc</w:t>
+      </w:r>
+      <w:r>
+        <w:rPr>
+          <w:rFonts w:ascii="Calibri" w:cs="Calibri" w:eastAsia="Calibri" w:hAnsi="Calibri"/>
+          <w:color w:val="1B1F1F"/>
+          <w:sz w:val="21"/>
+          <w:szCs w:val="21"/>
+        </w:rPr>
+        <w:t xml:space="preserve"> chứa địa chỉ máy chủ và tên model? Trả lời bằng một tình huống cụ thể, không chép nguyên văn tài liệu.</w:t>
       </w:r>
     </w:p>
     <w:p>
@@ -493,7 +650,25 @@
           <w:sz w:val="21"/>
           <w:szCs w:val="21"/>
         </w:rPr>
-        <w:t xml:space="preserve">Gợi ý cho câu 3: đọc </w:t>
+        <w:t xml:space="preserve">Gợi ý: </w:t>
+      </w:r>
+      <w:r>
+        <w:rPr>
+          <w:rFonts w:ascii="Consolas" w:cs="Consolas" w:eastAsia="Consolas" w:hAnsi="Consolas"/>
+          <w:color w:val="0B3F41"/>
+          <w:sz w:val="20"/>
+          <w:szCs w:val="20"/>
+        </w:rPr>
+        <w:t xml:space="preserve">SPEC-LLM-02</w:t>
+      </w:r>
+      <w:r>
+        <w:rPr>
+          <w:rFonts w:ascii="Calibri" w:cs="Calibri" w:eastAsia="Calibri" w:hAnsi="Calibri"/>
+          <w:color w:val="1B1F1F"/>
+          <w:sz w:val="21"/>
+          <w:szCs w:val="21"/>
+        </w:rPr>
+        <w:t xml:space="preserve">, ADR-0002, </w:t>
       </w:r>
       <w:r>
         <w:rPr>
@@ -511,7 +686,7 @@
           <w:sz w:val="21"/>
           <w:szCs w:val="21"/>
         </w:rPr>
-        <w:t xml:space="preserve"> và ADR-0002. Câu trả lời "để chạy nhanh hơn" là câu trả lời sai.</w:t>
+        <w:t xml:space="preserve">. Câu trả lời "để chạy nhanh hơn" là câu trả lời sai.</w:t>
       </w:r>
     </w:p>
     <w:p>
@@ -536,7 +711,7 @@
           <w:sz w:val="21"/>
           <w:szCs w:val="21"/>
         </w:rPr>
-        <w:t xml:space="preserve"> bản đồ thành phần — mỗi thành phần của slide gắn với tệp trong repo.</w:t>
+        <w:t xml:space="preserve"> bảng hành trình ticket, bản đồ thành phần, phân tích về cache.</w:t>
       </w:r>
     </w:p>
     <w:p>
@@ -553,6 +728,7 @@
     <w:p>
       <w:pPr>
         <w:pStyle w:val="Heading2"/>
+        <w:keepNext/>
         <w:spacing w:after="120" w:before="280"/>
       </w:pPr>
       <w:r>
@@ -564,7 +740,7 @@
           <w:sz w:val="24"/>
           <w:szCs w:val="24"/>
         </w:rPr>
-        <w:t xml:space="preserve">Bước 2 — Xác định ranh giới và cách điều phối (20 phút)</w:t>
+        <w:t xml:space="preserve">Bước 2 — Xác định ranh giới: ai được quyết định điều gì? (20 phút)</w:t>
       </w:r>
     </w:p>
     <w:p>
@@ -593,16 +769,36 @@
           <w:sz w:val="21"/>
           <w:szCs w:val="21"/>
         </w:rPr>
-        <w:t xml:space="preserve">Ai quyết định gì (slide 8):</w:t>
-      </w:r>
-      <w:r>
-        <w:rPr>
-          <w:rFonts w:ascii="Calibri" w:cs="Calibri" w:eastAsia="Calibri" w:hAnsi="Calibri"/>
-          <w:color w:val="1B1F1F"/>
-          <w:sz w:val="21"/>
-          <w:szCs w:val="21"/>
-        </w:rPr>
-        <w:t xml:space="preserve"> với bốn vai trò — AI, ứng dụng nghiệp vụ, hệ thống nghiệp vụ/dữ liệu, con người — ghi rõ việc được quyết định và việc </w:t>
+        <w:t xml:space="preserve">Bản đồ quyền quyết định (slide 8):</w:t>
+      </w:r>
+      <w:r>
+        <w:rPr>
+          <w:rFonts w:ascii="Calibri" w:cs="Calibri" w:eastAsia="Calibri" w:hAnsi="Calibri"/>
+          <w:color w:val="1B1F1F"/>
+          <w:sz w:val="21"/>
+          <w:szCs w:val="21"/>
+        </w:rPr>
+        <w:t xml:space="preserve"> với bốn vai trò — AI, ứng dụng nghiệp vụ, hệ thống nghiệp vụ/dữ liệu, con người — ghi việc </w:t>
+      </w:r>
+      <w:r>
+        <w:rPr>
+          <w:rFonts w:ascii="Calibri" w:cs="Calibri" w:eastAsia="Calibri" w:hAnsi="Calibri"/>
+          <w:b/>
+          <w:bCs/>
+          <w:color w:val="1B1F1F"/>
+          <w:sz w:val="21"/>
+          <w:szCs w:val="21"/>
+        </w:rPr>
+        <w:t xml:space="preserve">được</w:t>
+      </w:r>
+      <w:r>
+        <w:rPr>
+          <w:rFonts w:ascii="Calibri" w:cs="Calibri" w:eastAsia="Calibri" w:hAnsi="Calibri"/>
+          <w:color w:val="1B1F1F"/>
+          <w:sz w:val="21"/>
+          <w:szCs w:val="21"/>
+        </w:rPr>
+        <w:t xml:space="preserve"> làm và việc </w:t>
       </w:r>
       <w:r>
         <w:rPr>
@@ -622,7 +818,7 @@
           <w:sz w:val="21"/>
           <w:szCs w:val="21"/>
         </w:rPr>
-        <w:t xml:space="preserve"> làm. Xác định mô hình tương tác (slide 12) và mức tự chủ trên thang Ask → Assist → Suggest → Act.</w:t>
+        <w:t xml:space="preserve"> làm, dựa trên các trích dẫn có thật trong tài liệu và mã. Xác định mô hình tương tác (slide 12) và mức tự chủ trên thang Ask → Assist → Suggest → Act.</w:t>
       </w:r>
     </w:p>
     <w:p>
@@ -651,16 +847,16 @@
           <w:sz w:val="21"/>
           <w:szCs w:val="21"/>
         </w:rPr>
-        <w:t xml:space="preserve">Workflow hay Agent (slide 16):</w:t>
-      </w:r>
-      <w:r>
-        <w:rPr>
-          <w:rFonts w:ascii="Calibri" w:cs="Calibri" w:eastAsia="Calibri" w:hAnsi="Calibri"/>
-          <w:color w:val="1B1F1F"/>
-          <w:sz w:val="21"/>
-          <w:szCs w:val="21"/>
-        </w:rPr>
-        <w:t xml:space="preserve"> đi lần lượt bốn câu hỏi quyết định, mỗi câu trả lời kèm bằng chứng từ code, rồi chọn một trong bốn mức. Trả lời câu thảo luận ở slide 17.</w:t>
+        <w:t xml:space="preserve">Workflow hay Agent (slide 16, 17):</w:t>
+      </w:r>
+      <w:r>
+        <w:rPr>
+          <w:rFonts w:ascii="Calibri" w:cs="Calibri" w:eastAsia="Calibri" w:hAnsi="Calibri"/>
+          <w:color w:val="1B1F1F"/>
+          <w:sz w:val="21"/>
+          <w:szCs w:val="21"/>
+        </w:rPr>
+        <w:t xml:space="preserve"> đi lần lượt bốn câu hỏi quyết định, mỗi câu kèm dẫn chứng, chọn một trong bốn mức và bảo vệ lựa chọn.</w:t>
       </w:r>
     </w:p>
     <w:p>
@@ -689,16 +885,16 @@
           <w:sz w:val="21"/>
           <w:szCs w:val="21"/>
         </w:rPr>
-        <w:t xml:space="preserve">Tool Contract (slide 22):</w:t>
-      </w:r>
-      <w:r>
-        <w:rPr>
-          <w:rFonts w:ascii="Calibri" w:cs="Calibri" w:eastAsia="Calibri" w:hAnsi="Calibri"/>
-          <w:color w:val="1B1F1F"/>
-          <w:sz w:val="21"/>
-          <w:szCs w:val="21"/>
-        </w:rPr>
-        <w:t xml:space="preserve"> chọn một tool trong </w:t>
+        <w:t xml:space="preserve">Tool Contract (slide 22, 23):</w:t>
+      </w:r>
+      <w:r>
+        <w:rPr>
+          <w:rFonts w:ascii="Calibri" w:cs="Calibri" w:eastAsia="Calibri" w:hAnsi="Calibri"/>
+          <w:color w:val="1B1F1F"/>
+          <w:sz w:val="21"/>
+          <w:szCs w:val="21"/>
+        </w:rPr>
+        <w:t xml:space="preserve"> chọn một công cụ trong </w:t>
       </w:r>
       <w:r>
         <w:rPr>
@@ -716,7 +912,27 @@
           <w:sz w:val="21"/>
           <w:szCs w:val="21"/>
         </w:rPr>
-        <w:t xml:space="preserve"> và mô tả năm phần hợp đồng — Input, Permission, Business Rules, Execution, Output. Phần nào chưa có trong code thì ghi "chưa có". Giải thích vì sao model không nên truy cập thẳng dữ liệu (slide 23).</w:t>
+        <w:t xml:space="preserve">, mô tả năm phần hợp đồng — Input, Permission, Business Rules, Execution, Output. Phần nào chưa có thì ghi "chưa có". Phân tích một chi tiết cụ thể trong công cụ đó và vì sao cần kiểm tra tham số </w:t>
+      </w:r>
+      <w:r>
+        <w:rPr>
+          <w:rFonts w:ascii="Calibri" w:cs="Calibri" w:eastAsia="Calibri" w:hAnsi="Calibri"/>
+          <w:b/>
+          <w:bCs/>
+          <w:color w:val="1B1F1F"/>
+          <w:sz w:val="21"/>
+          <w:szCs w:val="21"/>
+        </w:rPr>
+        <w:t xml:space="preserve">trước</w:t>
+      </w:r>
+      <w:r>
+        <w:rPr>
+          <w:rFonts w:ascii="Calibri" w:cs="Calibri" w:eastAsia="Calibri" w:hAnsi="Calibri"/>
+          <w:color w:val="1B1F1F"/>
+          <w:sz w:val="21"/>
+          <w:szCs w:val="21"/>
+        </w:rPr>
+        <w:t xml:space="preserve"> khi chạy.</w:t>
       </w:r>
     </w:p>
     <w:p>
@@ -741,7 +957,7 @@
           <w:sz w:val="21"/>
           <w:szCs w:val="21"/>
         </w:rPr>
-        <w:t xml:space="preserve"> bảng ranh giới, mức Workflow/Agent đã chọn, Tool Contract của một tool.</w:t>
+        <w:t xml:space="preserve"> bảng ranh giới, mức Workflow/Agent đã chọn, Tool Contract của một công cụ.</w:t>
       </w:r>
     </w:p>
     <w:p>
@@ -758,6 +974,7 @@
     <w:p>
       <w:pPr>
         <w:pStyle w:val="Heading2"/>
+        <w:keepNext/>
         <w:spacing w:after="120" w:before="280"/>
       </w:pPr>
       <w:r>
@@ -769,7 +986,7 @@
           <w:sz w:val="24"/>
           <w:szCs w:val="24"/>
         </w:rPr>
-        <w:t xml:space="preserve">Bước 3 — Chiến lược model (20 phút)</w:t>
+        <w:t xml:space="preserve">Bước 3 — Chiến lược model (15 phút)</w:t>
       </w:r>
     </w:p>
     <w:p>
@@ -791,7 +1008,7 @@
           <w:sz w:val="19"/>
           <w:szCs w:val="19"/>
         </w:rPr>
-        <w:t xml:space="preserve">CACHE_MODE=off uv run python scripts/compare_models.py --tickets 5</w:t>
+        <w:t xml:space="preserve">uv run python scripts/temperature_demo.py</w:t>
       </w:r>
     </w:p>
     <w:p>
@@ -805,27 +1022,186 @@
           <w:sz w:val="21"/>
           <w:szCs w:val="21"/>
         </w:rPr>
-        <w:t xml:space="preserve">Chạy trên cùng 5 ticket với bốn tổ hợp: cấu hình S, cấu hình L, và hai mức nhiệt độ (0.0 và 0.7). Ghi lại độ chính xác, p50 và số ca phải cứu bằng lớp phòng vệ, </w:t>
-      </w:r>
-      <w:r>
-        <w:rPr>
-          <w:rFonts w:ascii="Calibri" w:cs="Calibri" w:eastAsia="Calibri" w:hAnsi="Calibri"/>
-          <w:b/>
-          <w:bCs/>
-          <w:color w:val="1B1F1F"/>
-          <w:sz w:val="21"/>
-          <w:szCs w:val="21"/>
-        </w:rPr>
-        <w:t xml:space="preserve">kèm cột ghi chú cấu hình cho từng dòng</w:t>
-      </w:r>
-      <w:r>
-        <w:rPr>
-          <w:rFonts w:ascii="Calibri" w:cs="Calibri" w:eastAsia="Calibri" w:hAnsi="Calibri"/>
-          <w:color w:val="1B1F1F"/>
-          <w:sz w:val="21"/>
-          <w:szCs w:val="21"/>
-        </w:rPr>
-        <w:t xml:space="preserve">. Chạy lệnh trước, làm phần dưới trong lúc chờ.</w:t>
+        <w:t xml:space="preserve">Script hỏi model cùng một câu nhiều lần ở hai mức nhiệt độ (0.0 và 0.7) trên hai tác vụ — chọn nhóm cho ticket và soạn phản hồi — rồi đếm số câu trả lời khác nhau. Script tự tắt cache. Chạy lệnh trước; làm phần dưới trong lúc chờ.</w:t>
+      </w:r>
+    </w:p>
+    <w:p>
+      <w:pPr>
+        <w:tabs>
+          <w:tab w:val="left" w:pos="420"/>
+        </w:tabs>
+        <w:spacing w:after="70" w:line="300"/>
+        <w:ind w:left="420" w:hanging="300"/>
+      </w:pPr>
+      <w:r>
+        <w:rPr>
+          <w:rFonts w:ascii="Calibri" w:cs="Calibri" w:eastAsia="Calibri" w:hAnsi="Calibri"/>
+          <w:color w:val="1B1F1F"/>
+          <w:sz w:val="21"/>
+          <w:szCs w:val="21"/>
+        </w:rPr>
+        <w:t xml:space="preserve">1.	</w:t>
+      </w:r>
+      <w:r>
+        <w:rPr>
+          <w:rFonts w:ascii="Calibri" w:cs="Calibri" w:eastAsia="Calibri" w:hAnsi="Calibri"/>
+          <w:b/>
+          <w:bCs/>
+          <w:color w:val="1B1F1F"/>
+          <w:sz w:val="21"/>
+          <w:szCs w:val="21"/>
+        </w:rPr>
+        <w:t xml:space="preserve">Dự đoán rồi kiểm chứng:</w:t>
+      </w:r>
+      <w:r>
+        <w:rPr>
+          <w:rFonts w:ascii="Calibri" w:cs="Calibri" w:eastAsia="Calibri" w:hAnsi="Calibri"/>
+          <w:color w:val="1B1F1F"/>
+          <w:sz w:val="21"/>
+          <w:szCs w:val="21"/>
+        </w:rPr>
+        <w:t xml:space="preserve"> ghi dự đoán trước khi chạy, so với kết quả, và giải thích chỗ khác biệt.</w:t>
+      </w:r>
+    </w:p>
+    <w:p>
+      <w:pPr>
+        <w:tabs>
+          <w:tab w:val="left" w:pos="420"/>
+        </w:tabs>
+        <w:spacing w:after="70" w:line="300"/>
+        <w:ind w:left="420" w:hanging="300"/>
+      </w:pPr>
+      <w:r>
+        <w:rPr>
+          <w:rFonts w:ascii="Calibri" w:cs="Calibri" w:eastAsia="Calibri" w:hAnsi="Calibri"/>
+          <w:color w:val="1B1F1F"/>
+          <w:sz w:val="21"/>
+          <w:szCs w:val="21"/>
+        </w:rPr>
+        <w:t xml:space="preserve">2.	</w:t>
+      </w:r>
+      <w:r>
+        <w:rPr>
+          <w:rFonts w:ascii="Calibri" w:cs="Calibri" w:eastAsia="Calibri" w:hAnsi="Calibri"/>
+          <w:b/>
+          <w:bCs/>
+          <w:color w:val="1B1F1F"/>
+          <w:sz w:val="21"/>
+          <w:szCs w:val="21"/>
+        </w:rPr>
+        <w:t xml:space="preserve">Đọc </w:t>
+      </w:r>
+      <w:r>
+        <w:rPr>
+          <w:rFonts w:ascii="Consolas" w:cs="Consolas" w:eastAsia="Consolas" w:hAnsi="Consolas"/>
+          <w:color w:val="0B3F41"/>
+          <w:sz w:val="20"/>
+          <w:szCs w:val="20"/>
+        </w:rPr>
+        <w:t xml:space="preserve">TASK_PARAMS</w:t>
+      </w:r>
+      <w:r>
+        <w:rPr>
+          <w:rFonts w:ascii="Calibri" w:cs="Calibri" w:eastAsia="Calibri" w:hAnsi="Calibri"/>
+          <w:color w:val="1B1F1F"/>
+          <w:sz w:val="21"/>
+          <w:szCs w:val="21"/>
+        </w:rPr>
+        <w:t xml:space="preserve"> trong </w:t>
+      </w:r>
+      <w:r>
+        <w:rPr>
+          <w:rFonts w:ascii="Consolas" w:cs="Consolas" w:eastAsia="Consolas" w:hAnsi="Consolas"/>
+          <w:color w:val="0B3F41"/>
+          <w:sz w:val="20"/>
+          <w:szCs w:val="20"/>
+        </w:rPr>
+        <w:t xml:space="preserve">src/config.py</w:t>
+      </w:r>
+      <w:r>
+        <w:rPr>
+          <w:rFonts w:ascii="Calibri" w:cs="Calibri" w:eastAsia="Calibri" w:hAnsi="Calibri"/>
+          <w:color w:val="1B1F1F"/>
+          <w:sz w:val="21"/>
+          <w:szCs w:val="21"/>
+        </w:rPr>
+        <w:t xml:space="preserve"> và giải thích vì sao mỗi tác vụ được đặt nhiệt độ như vậy.</w:t>
+      </w:r>
+    </w:p>
+    <w:p>
+      <w:pPr>
+        <w:tabs>
+          <w:tab w:val="left" w:pos="420"/>
+        </w:tabs>
+        <w:spacing w:after="70" w:line="300"/>
+        <w:ind w:left="420" w:hanging="300"/>
+      </w:pPr>
+      <w:r>
+        <w:rPr>
+          <w:rFonts w:ascii="Calibri" w:cs="Calibri" w:eastAsia="Calibri" w:hAnsi="Calibri"/>
+          <w:color w:val="1B1F1F"/>
+          <w:sz w:val="21"/>
+          <w:szCs w:val="21"/>
+        </w:rPr>
+        <w:t xml:space="preserve">3.	</w:t>
+      </w:r>
+      <w:r>
+        <w:rPr>
+          <w:rFonts w:ascii="Calibri" w:cs="Calibri" w:eastAsia="Calibri" w:hAnsi="Calibri"/>
+          <w:b/>
+          <w:bCs/>
+          <w:color w:val="1B1F1F"/>
+          <w:sz w:val="21"/>
+          <w:szCs w:val="21"/>
+        </w:rPr>
+        <w:t xml:space="preserve">Chọn model bằng bốn tiêu chí (slide 31):</w:t>
+      </w:r>
+      <w:r>
+        <w:rPr>
+          <w:rFonts w:ascii="Calibri" w:cs="Calibri" w:eastAsia="Calibri" w:hAnsi="Calibri"/>
+          <w:color w:val="1B1F1F"/>
+          <w:sz w:val="21"/>
+          <w:szCs w:val="21"/>
+        </w:rPr>
+        <w:t xml:space="preserve"> phù hợp năng lực, đủ chất lượng, khả thi vận hành, phù hợp doanh nghiệp — mỗi tiêu chí kèm bằng chứng. Phân tích hai trong ba kịch bản thay đổi.</w:t>
+      </w:r>
+    </w:p>
+    <w:p>
+      <w:pPr>
+        <w:tabs>
+          <w:tab w:val="left" w:pos="420"/>
+        </w:tabs>
+        <w:spacing w:after="70" w:line="300"/>
+        <w:ind w:left="420" w:hanging="300"/>
+      </w:pPr>
+      <w:r>
+        <w:rPr>
+          <w:rFonts w:ascii="Calibri" w:cs="Calibri" w:eastAsia="Calibri" w:hAnsi="Calibri"/>
+          <w:color w:val="1B1F1F"/>
+          <w:sz w:val="21"/>
+          <w:szCs w:val="21"/>
+        </w:rPr>
+        <w:t xml:space="preserve">4.	</w:t>
+      </w:r>
+      <w:r>
+        <w:rPr>
+          <w:rFonts w:ascii="Calibri" w:cs="Calibri" w:eastAsia="Calibri" w:hAnsi="Calibri"/>
+          <w:b/>
+          <w:bCs/>
+          <w:color w:val="1B1F1F"/>
+          <w:sz w:val="21"/>
+          <w:szCs w:val="21"/>
+        </w:rPr>
+        <w:t xml:space="preserve">Một model hay nhiều (slide 32–33):</w:t>
+      </w:r>
+      <w:r>
+        <w:rPr>
+          <w:rFonts w:ascii="Calibri" w:cs="Calibri" w:eastAsia="Calibri" w:hAnsi="Calibri"/>
+          <w:color w:val="1B1F1F"/>
+          <w:sz w:val="21"/>
+          <w:szCs w:val="21"/>
+        </w:rPr>
+        <w:t xml:space="preserve"> hệ thống dùng bao nhiêu model, mỗi model làm gì, và vì sao model embedding phải giống nhau ở cả hai cấu hình.</w:t>
       </w:r>
     </w:p>
     <w:p>
@@ -862,7 +1238,7 @@
           <w:sz w:val="20"/>
           <w:szCs w:val="20"/>
         </w:rPr>
-        <w:t xml:space="preserve"> tác vụ phân loại cho kết quả ổn định hơn hẳn ở nhiệt độ 0, trong khi tác vụ soạn phản hồi cần nhiệt độ cao hơn. Từ đó suy ra một ứng dụng AI </w:t>
+        <w:t xml:space="preserve"> một ứng dụng AI </w:t>
       </w:r>
       <w:r>
         <w:rPr>
@@ -875,7 +1251,7 @@
           <w:sz w:val="20"/>
           <w:szCs w:val="20"/>
         </w:rPr>
-        <w:t xml:space="preserve">không dùng chung một cấu hình model cho mọi bước</w:t>
+        <w:t xml:space="preserve">không dùng chung một cấu hình model cho mọi bước.</w:t>
       </w:r>
       <w:r>
         <w:rPr>
@@ -886,51 +1262,7 @@
           <w:sz w:val="20"/>
           <w:szCs w:val="20"/>
         </w:rPr>
-        <w:t xml:space="preserve"> — xem </w:t>
-      </w:r>
-      <w:r>
-        <w:rPr>
-          <w:rFonts w:ascii="Consolas" w:cs="Consolas" w:eastAsia="Consolas" w:hAnsi="Consolas"/>
-          <w:i/>
-          <w:iCs/>
-          <w:color w:val="0B3F41"/>
-          <w:sz w:val="19"/>
-          <w:szCs w:val="19"/>
-        </w:rPr>
-        <w:t xml:space="preserve">TASK_PARAMS</w:t>
-      </w:r>
-      <w:r>
-        <w:rPr>
-          <w:rFonts w:ascii="Calibri" w:cs="Calibri" w:eastAsia="Calibri" w:hAnsi="Calibri"/>
-          <w:i/>
-          <w:iCs/>
-          <w:color w:val="1B1F1F"/>
-          <w:sz w:val="20"/>
-          <w:szCs w:val="20"/>
-        </w:rPr>
-        <w:t xml:space="preserve"> trong </w:t>
-      </w:r>
-      <w:r>
-        <w:rPr>
-          <w:rFonts w:ascii="Consolas" w:cs="Consolas" w:eastAsia="Consolas" w:hAnsi="Consolas"/>
-          <w:i/>
-          <w:iCs/>
-          <w:color w:val="0B3F41"/>
-          <w:sz w:val="19"/>
-          <w:szCs w:val="19"/>
-        </w:rPr>
-        <w:t xml:space="preserve">src/config.py</w:t>
-      </w:r>
-      <w:r>
-        <w:rPr>
-          <w:rFonts w:ascii="Calibri" w:cs="Calibri" w:eastAsia="Calibri" w:hAnsi="Calibri"/>
-          <w:i/>
-          <w:iCs/>
-          <w:color w:val="1B1F1F"/>
-          <w:sz w:val="20"/>
-          <w:szCs w:val="20"/>
-        </w:rPr>
-        <w:t xml:space="preserve">.</w:t>
+        <w:t xml:space="preserve"> Phân loại cần đáp án lặp lại được; soạn phản hồi cần câu chữ tự nhiên.</w:t>
       </w:r>
     </w:p>
     <w:p>
@@ -940,11 +1272,51 @@
       <w:r>
         <w:rPr>
           <w:rFonts w:ascii="Calibri" w:cs="Calibri" w:eastAsia="Calibri" w:hAnsi="Calibri"/>
-          <w:color w:val="1B1F1F"/>
-          <w:sz w:val="21"/>
-          <w:szCs w:val="21"/>
-        </w:rPr>
-        <w:t xml:space="preserve">Sau đó:</w:t>
+          <w:b/>
+          <w:bCs/>
+          <w:color w:val="1B1F1F"/>
+          <w:sz w:val="21"/>
+          <w:szCs w:val="21"/>
+        </w:rPr>
+        <w:t xml:space="preserve">Sản phẩm:</w:t>
+      </w:r>
+      <w:r>
+        <w:rPr>
+          <w:rFonts w:ascii="Calibri" w:cs="Calibri" w:eastAsia="Calibri" w:hAnsi="Calibri"/>
+          <w:color w:val="1B1F1F"/>
+          <w:sz w:val="21"/>
+          <w:szCs w:val="21"/>
+        </w:rPr>
+        <w:t xml:space="preserve"> bảng dự đoán và kết quả, bảng chọn model.</w:t>
+      </w:r>
+    </w:p>
+    <w:p>
+      <w:pPr>
+        <w:pBdr>
+          <w:bottom w:val="single" w:color="BFD3D2" w:sz="4" w:space="1"/>
+        </w:pBdr>
+        <w:spacing w:after="200" w:before="120"/>
+      </w:pPr>
+      <w:r>
+        <w:t xml:space="preserve"/>
+      </w:r>
+    </w:p>
+    <w:p>
+      <w:pPr>
+        <w:pStyle w:val="Heading2"/>
+        <w:keepNext/>
+        <w:spacing w:after="120" w:before="280"/>
+      </w:pPr>
+      <w:r>
+        <w:rPr>
+          <w:rFonts w:ascii="Calibri" w:cs="Calibri" w:eastAsia="Calibri" w:hAnsi="Calibri"/>
+          <w:b/>
+          <w:bCs/>
+          <w:color w:val="0B3F41"/>
+          <w:sz w:val="24"/>
+          <w:szCs w:val="24"/>
+        </w:rPr>
+        <w:t xml:space="preserve">Bước 4 — Design Pattern và nhánh lỗi (15 phút)</w:t>
       </w:r>
     </w:p>
     <w:p>
@@ -973,16 +1345,16 @@
           <w:sz w:val="21"/>
           <w:szCs w:val="21"/>
         </w:rPr>
-        <w:t xml:space="preserve">Chọn model bằng bốn tiêu chí (slide 31):</w:t>
-      </w:r>
-      <w:r>
-        <w:rPr>
-          <w:rFonts w:ascii="Calibri" w:cs="Calibri" w:eastAsia="Calibri" w:hAnsi="Calibri"/>
-          <w:color w:val="1B1F1F"/>
-          <w:sz w:val="21"/>
-          <w:szCs w:val="21"/>
-        </w:rPr>
-        <w:t xml:space="preserve"> phù hợp năng lực, đủ chất lượng, khả thi vận hành, phù hợp doanh nghiệp — mỗi tiêu chí kèm bằng chứng. Nêu một model khác đã cân nhắc và lý do loại.</w:t>
+        <w:t xml:space="preserve">Nhận diện pattern (slide 41):</w:t>
+      </w:r>
+      <w:r>
+        <w:rPr>
+          <w:rFonts w:ascii="Calibri" w:cs="Calibri" w:eastAsia="Calibri" w:hAnsi="Calibri"/>
+          <w:color w:val="1B1F1F"/>
+          <w:sz w:val="21"/>
+          <w:szCs w:val="21"/>
+        </w:rPr>
+        <w:t xml:space="preserve"> đi qua năm câu hỏi chọn pattern — Grounded Generation, Controlled Action, AI-Augmented Workflow, Bounded Agent, Human-in-the-Loop. Mỗi pattern được dùng phải chỉ ra dấu hiệu trong tài liệu hoặc mã; pattern không dùng phải có lý do. Mô tả hai pattern phối hợp ở đâu trong hành trình một ticket.</w:t>
       </w:r>
     </w:p>
     <w:p>
@@ -1011,16 +1383,70 @@
           <w:sz w:val="21"/>
           <w:szCs w:val="21"/>
         </w:rPr>
-        <w:t xml:space="preserve">Một model hay nhiều (slide 32–33):</w:t>
-      </w:r>
-      <w:r>
-        <w:rPr>
-          <w:rFonts w:ascii="Calibri" w:cs="Calibri" w:eastAsia="Calibri" w:hAnsi="Calibri"/>
-          <w:color w:val="1B1F1F"/>
-          <w:sz w:val="21"/>
-          <w:szCs w:val="21"/>
-        </w:rPr>
-        <w:t xml:space="preserve"> hệ thống đang dùng bao nhiêu model, mỗi model làm gì, và dấu hiệu nào sẽ khiến nhóm thêm một model nữa.</w:t>
+        <w:t xml:space="preserve">Nhánh lỗi (slide 26):</w:t>
+      </w:r>
+      <w:r>
+        <w:rPr>
+          <w:rFonts w:ascii="Calibri" w:cs="Calibri" w:eastAsia="Calibri" w:hAnsi="Calibri"/>
+          <w:color w:val="1B1F1F"/>
+          <w:sz w:val="21"/>
+          <w:szCs w:val="21"/>
+        </w:rPr>
+        <w:t xml:space="preserve"> chọn bốn lý do chuyển người trong </w:t>
+      </w:r>
+      <w:r>
+        <w:rPr>
+          <w:rFonts w:ascii="Consolas" w:cs="Consolas" w:eastAsia="Consolas" w:hAnsi="Consolas"/>
+          <w:color w:val="0B3F41"/>
+          <w:sz w:val="20"/>
+          <w:szCs w:val="20"/>
+        </w:rPr>
+        <w:t xml:space="preserve">EscalationReason</w:t>
+      </w:r>
+      <w:r>
+        <w:rPr>
+          <w:rFonts w:ascii="Calibri" w:cs="Calibri" w:eastAsia="Calibri" w:hAnsi="Calibri"/>
+          <w:color w:val="1B1F1F"/>
+          <w:sz w:val="21"/>
+          <w:szCs w:val="21"/>
+        </w:rPr>
+        <w:t xml:space="preserve"> / </w:t>
+      </w:r>
+      <w:r>
+        <w:rPr>
+          <w:rFonts w:ascii="Consolas" w:cs="Consolas" w:eastAsia="Consolas" w:hAnsi="Consolas"/>
+          <w:color w:val="0B3F41"/>
+          <w:sz w:val="20"/>
+          <w:szCs w:val="20"/>
+        </w:rPr>
+        <w:t xml:space="preserve">SPEC-FLOW-02</w:t>
+      </w:r>
+      <w:r>
+        <w:rPr>
+          <w:rFonts w:ascii="Calibri" w:cs="Calibri" w:eastAsia="Calibri" w:hAnsi="Calibri"/>
+          <w:color w:val="1B1F1F"/>
+          <w:sz w:val="21"/>
+          <w:szCs w:val="21"/>
+        </w:rPr>
+        <w:t xml:space="preserve"> và với mỗi lý do ghi khi nào xảy ra, ở bước nào, người duyệt thấy gì, và quy tắc có hợp lý không. Phân tích một điểm yếu cụ thể của một quy tắc (ví dụ danh sách từ khóa trong </w:t>
+      </w:r>
+      <w:r>
+        <w:rPr>
+          <w:rFonts w:ascii="Consolas" w:cs="Consolas" w:eastAsia="Consolas" w:hAnsi="Consolas"/>
+          <w:color w:val="0B3F41"/>
+          <w:sz w:val="20"/>
+          <w:szCs w:val="20"/>
+        </w:rPr>
+        <w:t xml:space="preserve">_money_dispute</w:t>
+      </w:r>
+      <w:r>
+        <w:rPr>
+          <w:rFonts w:ascii="Calibri" w:cs="Calibri" w:eastAsia="Calibri" w:hAnsi="Calibri"/>
+          <w:color w:val="1B1F1F"/>
+          <w:sz w:val="21"/>
+          <w:szCs w:val="21"/>
+        </w:rPr>
+        <w:t xml:space="preserve">).</w:t>
       </w:r>
     </w:p>
     <w:p>
@@ -1045,7 +1471,7 @@
           <w:sz w:val="21"/>
           <w:szCs w:val="21"/>
         </w:rPr>
-        <w:t xml:space="preserve"> bảng so sánh cấu hình và bảng chọn model.</w:t>
+        <w:t xml:space="preserve"> bảng nhận diện pattern, bảng nhánh lỗi.</w:t>
       </w:r>
     </w:p>
     <w:p>
@@ -1062,6 +1488,7 @@
     <w:p>
       <w:pPr>
         <w:pStyle w:val="Heading2"/>
+        <w:keepNext/>
         <w:spacing w:after="120" w:before="280"/>
       </w:pPr>
       <w:r>
@@ -1073,7 +1500,7 @@
           <w:sz w:val="24"/>
           <w:szCs w:val="24"/>
         </w:rPr>
-        <w:t xml:space="preserve">Bước 4 — Design Patterns, luồng end-to-end và Blueprint (25 phút)</w:t>
+        <w:t xml:space="preserve">Bước 5 — Viết Blueprint và ADR (25 phút)</w:t>
       </w:r>
     </w:p>
     <w:p>
@@ -1102,16 +1529,72 @@
           <w:sz w:val="21"/>
           <w:szCs w:val="21"/>
         </w:rPr>
-        <w:t xml:space="preserve">Chọn pattern (slide 41):</w:t>
-      </w:r>
-      <w:r>
-        <w:rPr>
-          <w:rFonts w:ascii="Calibri" w:cs="Calibri" w:eastAsia="Calibri" w:hAnsi="Calibri"/>
-          <w:color w:val="1B1F1F"/>
-          <w:sz w:val="21"/>
-          <w:szCs w:val="21"/>
-        </w:rPr>
-        <w:t xml:space="preserve"> đi qua năm câu hỏi chọn pattern — Grounded Generation, Controlled Action, AI-Augmented Workflow, Bounded Agent, Human-in-the-Loop. Mỗi pattern được dùng phải chỉ ra được nơi nó nằm trong code; pattern không dùng phải có lý do.</w:t>
+        <w:t xml:space="preserve">Blueprint:</w:t>
+      </w:r>
+      <w:r>
+        <w:rPr>
+          <w:rFonts w:ascii="Calibri" w:cs="Calibri" w:eastAsia="Calibri" w:hAnsi="Calibri"/>
+          <w:color w:val="1B1F1F"/>
+          <w:sz w:val="21"/>
+          <w:szCs w:val="21"/>
+        </w:rPr>
+        <w:t xml:space="preserve"> sao chép </w:t>
+      </w:r>
+      <w:r>
+        <w:rPr>
+          <w:rFonts w:ascii="Consolas" w:cs="Consolas" w:eastAsia="Consolas" w:hAnsi="Consolas"/>
+          <w:color w:val="0B3F41"/>
+          <w:sz w:val="20"/>
+          <w:szCs w:val="20"/>
+        </w:rPr>
+        <w:t xml:space="preserve">docs/blueprint-template.md</w:t>
+      </w:r>
+      <w:r>
+        <w:rPr>
+          <w:rFonts w:ascii="Calibri" w:cs="Calibri" w:eastAsia="Calibri" w:hAnsi="Calibri"/>
+          <w:color w:val="1B1F1F"/>
+          <w:sz w:val="21"/>
+          <w:szCs w:val="21"/>
+        </w:rPr>
+        <w:t xml:space="preserve"> thành </w:t>
+      </w:r>
+      <w:r>
+        <w:rPr>
+          <w:rFonts w:ascii="Consolas" w:cs="Consolas" w:eastAsia="Consolas" w:hAnsi="Consolas"/>
+          <w:color w:val="0B3F41"/>
+          <w:sz w:val="20"/>
+          <w:szCs w:val="20"/>
+        </w:rPr>
+        <w:t xml:space="preserve">docs/blueprint.md</w:t>
+      </w:r>
+      <w:r>
+        <w:rPr>
+          <w:rFonts w:ascii="Calibri" w:cs="Calibri" w:eastAsia="Calibri" w:hAnsi="Calibri"/>
+          <w:color w:val="1B1F1F"/>
+          <w:sz w:val="21"/>
+          <w:szCs w:val="21"/>
+        </w:rPr>
+        <w:t xml:space="preserve"> và điền chín mục — thành phần và dự phòng, bảy mục theo slide 43 (Use Case Contract, Context Contract, Model/Intelligence, Tool Contract, Agent/Workflow, Guardrails &amp; Policy, Evaluation), và những điều chưa giải quyết. Hầu hết nội dung lấy từ workbook. Blueprint mô tả </w:t>
+      </w:r>
+      <w:r>
+        <w:rPr>
+          <w:rFonts w:ascii="Calibri" w:cs="Calibri" w:eastAsia="Calibri" w:hAnsi="Calibri"/>
+          <w:b/>
+          <w:bCs/>
+          <w:color w:val="1B1F1F"/>
+          <w:sz w:val="21"/>
+          <w:szCs w:val="21"/>
+        </w:rPr>
+        <w:t xml:space="preserve">trách nhiệm và giao diện</w:t>
+      </w:r>
+      <w:r>
+        <w:rPr>
+          <w:rFonts w:ascii="Calibri" w:cs="Calibri" w:eastAsia="Calibri" w:hAnsi="Calibri"/>
+          <w:color w:val="1B1F1F"/>
+          <w:sz w:val="21"/>
+          <w:szCs w:val="21"/>
+        </w:rPr>
+        <w:t xml:space="preserve">, không mô tả cách hiện thực bên trong.</w:t>
       </w:r>
     </w:p>
     <w:p>
@@ -1140,231 +1623,34 @@
           <w:sz w:val="21"/>
           <w:szCs w:val="21"/>
         </w:rPr>
-        <w:t xml:space="preserve">Luồng end-to-end có nhánh lỗi:</w:t>
-      </w:r>
-      <w:r>
-        <w:rPr>
-          <w:rFonts w:ascii="Calibri" w:cs="Calibri" w:eastAsia="Calibri" w:hAnsi="Calibri"/>
-          <w:color w:val="1B1F1F"/>
-          <w:sz w:val="21"/>
-          <w:szCs w:val="21"/>
-        </w:rPr>
-        <w:t xml:space="preserve"> từng bước xử lý một ticket, ghi thành phần chịu trách nhiệm, guardrail đặt tại đó (slide 26 — guardrail phải đặt tại nơi rủi ro phát sinh, không chỉ ở đầu ra cuối) và </w:t>
-      </w:r>
-      <w:r>
-        <w:rPr>
-          <w:rFonts w:ascii="Calibri" w:cs="Calibri" w:eastAsia="Calibri" w:hAnsi="Calibri"/>
-          <w:b/>
-          <w:bCs/>
-          <w:color w:val="1B1F1F"/>
-          <w:sz w:val="21"/>
-          <w:szCs w:val="21"/>
-        </w:rPr>
-        <w:t xml:space="preserve">phương án dự phòng khi bước đó lỗi hoặc không chắc</w:t>
-      </w:r>
-      <w:r>
-        <w:rPr>
-          <w:rFonts w:ascii="Calibri" w:cs="Calibri" w:eastAsia="Calibri" w:hAnsi="Calibri"/>
-          <w:color w:val="1B1F1F"/>
-          <w:sz w:val="21"/>
-          <w:szCs w:val="21"/>
-        </w:rPr>
-        <w:t xml:space="preserve">.</w:t>
-      </w:r>
-    </w:p>
-    <w:p>
-      <w:pPr>
-        <w:tabs>
-          <w:tab w:val="left" w:pos="420"/>
-        </w:tabs>
-        <w:spacing w:after="70" w:line="300"/>
-        <w:ind w:left="420" w:hanging="300"/>
-      </w:pPr>
-      <w:r>
-        <w:rPr>
-          <w:rFonts w:ascii="Calibri" w:cs="Calibri" w:eastAsia="Calibri" w:hAnsi="Calibri"/>
-          <w:color w:val="1B1F1F"/>
-          <w:sz w:val="21"/>
-          <w:szCs w:val="21"/>
-        </w:rPr>
-        <w:t xml:space="preserve">3.	</w:t>
-      </w:r>
-      <w:r>
-        <w:rPr>
-          <w:rFonts w:ascii="Calibri" w:cs="Calibri" w:eastAsia="Calibri" w:hAnsi="Calibri"/>
-          <w:b/>
-          <w:bCs/>
-          <w:color w:val="1B1F1F"/>
-          <w:sz w:val="21"/>
-          <w:szCs w:val="21"/>
-        </w:rPr>
-        <w:t xml:space="preserve">Viết</w:t>
-      </w:r>
-      <w:r>
-        <w:rPr>
-          <w:rFonts w:ascii="Calibri" w:cs="Calibri" w:eastAsia="Calibri" w:hAnsi="Calibri"/>
-          <w:color w:val="1B1F1F"/>
-          <w:sz w:val="21"/>
-          <w:szCs w:val="21"/>
-        </w:rPr>
-        <w:t xml:space="preserve"> </w:t>
-      </w:r>
-      <w:r>
-        <w:rPr>
-          <w:rFonts w:ascii="Consolas" w:cs="Consolas" w:eastAsia="Consolas" w:hAnsi="Consolas"/>
-          <w:color w:val="0B3F41"/>
-          <w:sz w:val="20"/>
-          <w:szCs w:val="20"/>
-        </w:rPr>
-        <w:t xml:space="preserve">docs/blueprint.md</w:t>
-      </w:r>
-      <w:r>
-        <w:rPr>
-          <w:rFonts w:ascii="Calibri" w:cs="Calibri" w:eastAsia="Calibri" w:hAnsi="Calibri"/>
-          <w:color w:val="1B1F1F"/>
-          <w:sz w:val="21"/>
-          <w:szCs w:val="21"/>
-        </w:rPr>
-        <w:t xml:space="preserve"> </w:t>
-      </w:r>
-      <w:r>
-        <w:rPr>
-          <w:rFonts w:ascii="Calibri" w:cs="Calibri" w:eastAsia="Calibri" w:hAnsi="Calibri"/>
-          <w:b/>
-          <w:bCs/>
-          <w:color w:val="1B1F1F"/>
-          <w:sz w:val="21"/>
-          <w:szCs w:val="21"/>
-        </w:rPr>
-        <w:t xml:space="preserve">gồm bảy mục theo slide 43:</w:t>
-      </w:r>
-      <w:r>
-        <w:rPr>
-          <w:rFonts w:ascii="Calibri" w:cs="Calibri" w:eastAsia="Calibri" w:hAnsi="Calibri"/>
-          <w:color w:val="1B1F1F"/>
-          <w:sz w:val="21"/>
-          <w:szCs w:val="21"/>
-        </w:rPr>
-        <w:t xml:space="preserve"> Use Case Contract, Context Contract, Model/Intelligence, Tool Contract, Agent/Workflow, Guardrails &amp; Policy, Evaluation — cùng sơ đồ năm tầng.</w:t>
-      </w:r>
-    </w:p>
-    <w:p>
-      <w:pPr>
-        <w:spacing w:after="140" w:line="300"/>
-      </w:pPr>
-      <w:r>
-        <w:rPr>
-          <w:rFonts w:ascii="Calibri" w:cs="Calibri" w:eastAsia="Calibri" w:hAnsi="Calibri"/>
-          <w:color w:val="1B1F1F"/>
-          <w:sz w:val="21"/>
-          <w:szCs w:val="21"/>
-        </w:rPr>
-        <w:t xml:space="preserve">Blueprint mô tả </w:t>
-      </w:r>
-      <w:r>
-        <w:rPr>
-          <w:rFonts w:ascii="Calibri" w:cs="Calibri" w:eastAsia="Calibri" w:hAnsi="Calibri"/>
-          <w:b/>
-          <w:bCs/>
-          <w:color w:val="1B1F1F"/>
-          <w:sz w:val="21"/>
-          <w:szCs w:val="21"/>
-        </w:rPr>
-        <w:t xml:space="preserve">trách nhiệm và giao diện</w:t>
-      </w:r>
-      <w:r>
-        <w:rPr>
-          <w:rFonts w:ascii="Calibri" w:cs="Calibri" w:eastAsia="Calibri" w:hAnsi="Calibri"/>
-          <w:color w:val="1B1F1F"/>
-          <w:sz w:val="21"/>
-          <w:szCs w:val="21"/>
-        </w:rPr>
-        <w:t xml:space="preserve">, không mô tả cách hiện thực bên trong. Vẽ tới mức mã nguồn là lỗi thường gặp nhất ở buổi này.</w:t>
-      </w:r>
-    </w:p>
-    <w:p>
-      <w:pPr>
-        <w:spacing w:after="140" w:line="300"/>
-      </w:pPr>
-      <w:r>
-        <w:rPr>
-          <w:rFonts w:ascii="Calibri" w:cs="Calibri" w:eastAsia="Calibri" w:hAnsi="Calibri"/>
-          <w:b/>
-          <w:bCs/>
-          <w:color w:val="1B1F1F"/>
-          <w:sz w:val="21"/>
-          <w:szCs w:val="21"/>
-        </w:rPr>
-        <w:t xml:space="preserve">Sản phẩm:</w:t>
-      </w:r>
-      <w:r>
-        <w:rPr>
-          <w:rFonts w:ascii="Calibri" w:cs="Calibri" w:eastAsia="Calibri" w:hAnsi="Calibri"/>
-          <w:color w:val="1B1F1F"/>
-          <w:sz w:val="21"/>
-          <w:szCs w:val="21"/>
-        </w:rPr>
-        <w:t xml:space="preserve"> </w:t>
-      </w:r>
-      <w:r>
-        <w:rPr>
-          <w:rFonts w:ascii="Consolas" w:cs="Consolas" w:eastAsia="Consolas" w:hAnsi="Consolas"/>
-          <w:color w:val="0B3F41"/>
-          <w:sz w:val="20"/>
-          <w:szCs w:val="20"/>
-        </w:rPr>
-        <w:t xml:space="preserve">docs/blueprint.md</w:t>
-      </w:r>
-      <w:r>
-        <w:rPr>
-          <w:rFonts w:ascii="Calibri" w:cs="Calibri" w:eastAsia="Calibri" w:hAnsi="Calibri"/>
-          <w:color w:val="1B1F1F"/>
-          <w:sz w:val="21"/>
-          <w:szCs w:val="21"/>
-        </w:rPr>
-        <w:t xml:space="preserve">.</w:t>
-      </w:r>
-    </w:p>
-    <w:p>
-      <w:pPr>
-        <w:pBdr>
-          <w:bottom w:val="single" w:color="BFD3D2" w:sz="4" w:space="1"/>
-        </w:pBdr>
-        <w:spacing w:after="200" w:before="120"/>
-      </w:pPr>
-      <w:r>
-        <w:t xml:space="preserve"/>
-      </w:r>
-    </w:p>
-    <w:p>
-      <w:pPr>
-        <w:pStyle w:val="Heading2"/>
-        <w:spacing w:after="120" w:before="280"/>
-      </w:pPr>
-      <w:r>
-        <w:rPr>
-          <w:rFonts w:ascii="Calibri" w:cs="Calibri" w:eastAsia="Calibri" w:hAnsi="Calibri"/>
-          <w:b/>
-          <w:bCs/>
-          <w:color w:val="0B3F41"/>
-          <w:sz w:val="24"/>
-          <w:szCs w:val="24"/>
-        </w:rPr>
-        <w:t xml:space="preserve">Bước 5 — Ghi lại thành ADR (15 phút)</w:t>
-      </w:r>
-    </w:p>
-    <w:p>
-      <w:pPr>
-        <w:spacing w:after="140" w:line="300"/>
-      </w:pPr>
-      <w:r>
-        <w:rPr>
-          <w:rFonts w:ascii="Calibri" w:cs="Calibri" w:eastAsia="Calibri" w:hAnsi="Calibri"/>
-          <w:color w:val="1B1F1F"/>
-          <w:sz w:val="21"/>
-          <w:szCs w:val="21"/>
-        </w:rPr>
-        <w:t xml:space="preserve">Tối thiểu 5 ADR, lấy từ chính các quyết định vừa đưa ra ở Bước 2–4 (mức Workflow/Agent, ranh giới cho tool, chọn model, số lượng model, pattern). Mẫu bốn phần ở </w:t>
+        <w:t xml:space="preserve">Tối thiểu 5 ADR</w:t>
+      </w:r>
+      <w:r>
+        <w:rPr>
+          <w:rFonts w:ascii="Calibri" w:cs="Calibri" w:eastAsia="Calibri" w:hAnsi="Calibri"/>
+          <w:color w:val="1B1F1F"/>
+          <w:sz w:val="21"/>
+          <w:szCs w:val="21"/>
+        </w:rPr>
+        <w:t xml:space="preserve"> mới, đánh số từ </w:t>
+      </w:r>
+      <w:r>
+        <w:rPr>
+          <w:rFonts w:ascii="Consolas" w:cs="Consolas" w:eastAsia="Consolas" w:hAnsi="Consolas"/>
+          <w:color w:val="0B3F41"/>
+          <w:sz w:val="20"/>
+          <w:szCs w:val="20"/>
+        </w:rPr>
+        <w:t xml:space="preserve">0006</w:t>
+      </w:r>
+      <w:r>
+        <w:rPr>
+          <w:rFonts w:ascii="Calibri" w:cs="Calibri" w:eastAsia="Calibri" w:hAnsi="Calibri"/>
+          <w:color w:val="1B1F1F"/>
+          <w:sz w:val="21"/>
+          <w:szCs w:val="21"/>
+        </w:rPr>
+        <w:t xml:space="preserve">, lấy từ chính các quyết định vừa phân tích. Mẫu bốn phần ở </w:t>
       </w:r>
       <w:r>
         <w:rPr>
@@ -1476,82 +1762,6 @@
     <w:p>
       <w:pPr>
         <w:pBdr>
-          <w:top w:val="single" w:color="FCEBE9" w:sz="2" w:space="4"/>
-          <w:bottom w:val="single" w:color="FCEBE9" w:sz="2" w:space="4"/>
-          <w:left w:val="single" w:color="B3261E" w:sz="24" w:space="8"/>
-          <w:right w:val="single" w:color="FCEBE9" w:sz="2" w:space="4"/>
-        </w:pBdr>
-        <w:shd w:fill="FCEBE9" w:val="clear"/>
-        <w:spacing w:after="200" w:before="100" w:line="300"/>
-        <w:ind w:left="100"/>
-      </w:pPr>
-      <w:r>
-        <w:rPr>
-          <w:rFonts w:ascii="Calibri" w:cs="Calibri" w:eastAsia="Calibri" w:hAnsi="Calibri"/>
-          <w:b/>
-          <w:bCs/>
-          <w:color w:val="B3261E"/>
-          <w:sz w:val="20"/>
-          <w:szCs w:val="20"/>
-        </w:rPr>
-        <w:t xml:space="preserve">⚠  </w:t>
-      </w:r>
-      <w:r>
-        <w:rPr>
-          <w:rFonts w:ascii="Calibri" w:cs="Calibri" w:eastAsia="Calibri" w:hAnsi="Calibri"/>
-          <w:b/>
-          <w:bCs/>
-          <w:color w:val="1B1F1F"/>
-          <w:sz w:val="20"/>
-          <w:szCs w:val="20"/>
-        </w:rPr>
-        <w:t xml:space="preserve">Một ADR chỉ ghi "đã chọn gì" mà không ghi phương án đã loại và lý do loại thì không phải ADR</w:t>
-      </w:r>
-      <w:r>
-        <w:rPr>
-          <w:rFonts w:ascii="Calibri" w:cs="Calibri" w:eastAsia="Calibri" w:hAnsi="Calibri"/>
-          <w:color w:val="1B1F1F"/>
-          <w:sz w:val="20"/>
-          <w:szCs w:val="20"/>
-        </w:rPr>
-        <w:t xml:space="preserve">, và không dùng để bảo vệ ở buổi cuối được.</w:t>
-      </w:r>
-    </w:p>
-    <w:p>
-      <w:pPr>
-        <w:spacing w:after="140" w:line="300"/>
-      </w:pPr>
-      <w:r>
-        <w:rPr>
-          <w:rFonts w:ascii="Calibri" w:cs="Calibri" w:eastAsia="Calibri" w:hAnsi="Calibri"/>
-          <w:color w:val="1B1F1F"/>
-          <w:sz w:val="21"/>
-          <w:szCs w:val="21"/>
-        </w:rPr>
-        <w:t xml:space="preserve">Năm ADR mẫu có sẵn trong </w:t>
-      </w:r>
-      <w:r>
-        <w:rPr>
-          <w:rFonts w:ascii="Consolas" w:cs="Consolas" w:eastAsia="Consolas" w:hAnsi="Consolas"/>
-          <w:color w:val="0B3F41"/>
-          <w:sz w:val="20"/>
-          <w:szCs w:val="20"/>
-        </w:rPr>
-        <w:t xml:space="preserve">docs/adr/</w:t>
-      </w:r>
-      <w:r>
-        <w:rPr>
-          <w:rFonts w:ascii="Calibri" w:cs="Calibri" w:eastAsia="Calibri" w:hAnsi="Calibri"/>
-          <w:color w:val="1B1F1F"/>
-          <w:sz w:val="21"/>
-          <w:szCs w:val="21"/>
-        </w:rPr>
-        <w:t xml:space="preserve"> để tham khảo cách viết. Nhóm phải tự viết ADR cho quyết định của mình, không sao chép.</w:t>
-      </w:r>
-    </w:p>
-    <w:p>
-      <w:pPr>
-        <w:pBdr>
           <w:top w:val="single" w:color="FBF2E1" w:sz="2" w:space="4"/>
           <w:bottom w:val="single" w:color="FBF2E1" w:sz="2" w:space="4"/>
           <w:left w:val="single" w:color="B8860B" w:sz="24" w:space="8"/>
@@ -1572,7 +1782,7 @@
           <w:sz w:val="20"/>
           <w:szCs w:val="20"/>
         </w:rPr>
-        <w:t xml:space="preserve">Bảng quyết định thiết kế ở Bước 5 chính là tài liệu dùng để phản biện ở Session 6.</w:t>
+        <w:t xml:space="preserve">Một ADR chỉ ghi "đã chọn gì" mà không ghi phương án đã loại và lý do loại thì không phải ADR</w:t>
       </w:r>
       <w:r>
         <w:rPr>
@@ -1583,7 +1793,7 @@
           <w:sz w:val="20"/>
           <w:szCs w:val="20"/>
         </w:rPr>
-        <w:t xml:space="preserve"> Ghi chép nghiêm túc từ bây giờ thay vì cố nhớ lại vào ngày cuối. Phần bảo vệ quyết định thiết kế chiếm 1,5/10 điểm cuối khóa.</w:t>
+        <w:t xml:space="preserve">, và không dùng để bảo vệ ở buổi cuối được.</w:t>
       </w:r>
     </w:p>
     <w:p>
@@ -1593,6 +1803,56 @@
       <w:r>
         <w:rPr>
           <w:rFonts w:ascii="Calibri" w:cs="Calibri" w:eastAsia="Calibri" w:hAnsi="Calibri"/>
+          <w:color w:val="1B1F1F"/>
+          <w:sz w:val="21"/>
+          <w:szCs w:val="21"/>
+        </w:rPr>
+        <w:t xml:space="preserve">Năm ADR mẫu (</w:t>
+      </w:r>
+      <w:r>
+        <w:rPr>
+          <w:rFonts w:ascii="Consolas" w:cs="Consolas" w:eastAsia="Consolas" w:hAnsi="Consolas"/>
+          <w:color w:val="0B3F41"/>
+          <w:sz w:val="20"/>
+          <w:szCs w:val="20"/>
+        </w:rPr>
+        <w:t xml:space="preserve">0001</w:t>
+      </w:r>
+      <w:r>
+        <w:rPr>
+          <w:rFonts w:ascii="Calibri" w:cs="Calibri" w:eastAsia="Calibri" w:hAnsi="Calibri"/>
+          <w:color w:val="1B1F1F"/>
+          <w:sz w:val="21"/>
+          <w:szCs w:val="21"/>
+        </w:rPr>
+        <w:t xml:space="preserve">–</w:t>
+      </w:r>
+      <w:r>
+        <w:rPr>
+          <w:rFonts w:ascii="Consolas" w:cs="Consolas" w:eastAsia="Consolas" w:hAnsi="Consolas"/>
+          <w:color w:val="0B3F41"/>
+          <w:sz w:val="20"/>
+          <w:szCs w:val="20"/>
+        </w:rPr>
+        <w:t xml:space="preserve">0005</w:t>
+      </w:r>
+      <w:r>
+        <w:rPr>
+          <w:rFonts w:ascii="Calibri" w:cs="Calibri" w:eastAsia="Calibri" w:hAnsi="Calibri"/>
+          <w:color w:val="1B1F1F"/>
+          <w:sz w:val="21"/>
+          <w:szCs w:val="21"/>
+        </w:rPr>
+        <w:t xml:space="preserve">) có sẵn để tham khảo cách viết. Nhóm phải tự viết ADR cho quyết định của mình, không sao chép.</w:t>
+      </w:r>
+    </w:p>
+    <w:p>
+      <w:pPr>
+        <w:spacing w:after="140" w:line="300"/>
+      </w:pPr>
+      <w:r>
+        <w:rPr>
+          <w:rFonts w:ascii="Calibri" w:cs="Calibri" w:eastAsia="Calibri" w:hAnsi="Calibri"/>
           <w:b/>
           <w:bCs/>
           <w:color w:val="1B1F1F"/>
@@ -1608,7 +1868,25 @@
           <w:sz w:val="21"/>
           <w:szCs w:val="21"/>
         </w:rPr>
-        <w:t xml:space="preserve"> 5 ADR.</w:t>
+        <w:t xml:space="preserve"> </w:t>
+      </w:r>
+      <w:r>
+        <w:rPr>
+          <w:rFonts w:ascii="Consolas" w:cs="Consolas" w:eastAsia="Consolas" w:hAnsi="Consolas"/>
+          <w:color w:val="0B3F41"/>
+          <w:sz w:val="20"/>
+          <w:szCs w:val="20"/>
+        </w:rPr>
+        <w:t xml:space="preserve">docs/blueprint.md</w:t>
+      </w:r>
+      <w:r>
+        <w:rPr>
+          <w:rFonts w:ascii="Calibri" w:cs="Calibri" w:eastAsia="Calibri" w:hAnsi="Calibri"/>
+          <w:color w:val="1B1F1F"/>
+          <w:sz w:val="21"/>
+          <w:szCs w:val="21"/>
+        </w:rPr>
+        <w:t xml:space="preserve"> và 5 ADR.</w:t>
       </w:r>
     </w:p>
     <w:p>
@@ -1625,6 +1903,7 @@
     <w:p>
       <w:pPr>
         <w:pStyle w:val="Heading2"/>
+        <w:keepNext/>
         <w:spacing w:after="120" w:before="280"/>
       </w:pPr>
       <w:r>
@@ -1636,23 +1915,36 @@
           <w:sz w:val="24"/>
           <w:szCs w:val="24"/>
         </w:rPr>
-        <w:t xml:space="preserve">Bước 6 — Nối dây và kích hoạt quy trình kỹ thuật (15 phút)</w:t>
-      </w:r>
-    </w:p>
-    <w:p>
-      <w:pPr>
-        <w:spacing w:after="140" w:line="300"/>
-      </w:pPr>
-      <w:r>
-        <w:rPr>
-          <w:rFonts w:ascii="Calibri" w:cs="Calibri" w:eastAsia="Calibri" w:hAnsi="Calibri"/>
-          <w:b/>
-          <w:bCs/>
-          <w:color w:val="1B1F1F"/>
-          <w:sz w:val="21"/>
-          <w:szCs w:val="21"/>
-        </w:rPr>
-        <w:t xml:space="preserve">1. Kiểm chứng chuyển đổi cấu hình chỉ bằng biến môi trường</w:t>
+        <w:t xml:space="preserve">Bước 6 — Chạy thử và quan sát (15 phút)</w:t>
+      </w:r>
+    </w:p>
+    <w:p>
+      <w:pPr>
+        <w:tabs>
+          <w:tab w:val="left" w:pos="420"/>
+        </w:tabs>
+        <w:spacing w:after="70" w:line="300"/>
+        <w:ind w:left="420" w:hanging="300"/>
+      </w:pPr>
+      <w:r>
+        <w:rPr>
+          <w:rFonts w:ascii="Calibri" w:cs="Calibri" w:eastAsia="Calibri" w:hAnsi="Calibri"/>
+          <w:color w:val="1B1F1F"/>
+          <w:sz w:val="21"/>
+          <w:szCs w:val="21"/>
+        </w:rPr>
+        <w:t xml:space="preserve">1.	</w:t>
+      </w:r>
+      <w:r>
+        <w:rPr>
+          <w:rFonts w:ascii="Calibri" w:cs="Calibri" w:eastAsia="Calibri" w:hAnsi="Calibri"/>
+          <w:b/>
+          <w:bCs/>
+          <w:color w:val="1B1F1F"/>
+          <w:sz w:val="21"/>
+          <w:szCs w:val="21"/>
+        </w:rPr>
+        <w:t xml:space="preserve">Chuyển cấu hình chỉ bằng biến môi trường</w:t>
       </w:r>
       <w:r>
         <w:rPr>
@@ -1715,22 +2007,159 @@
       <w:r>
         <w:rPr>
           <w:rFonts w:ascii="Calibri" w:cs="Calibri" w:eastAsia="Calibri" w:hAnsi="Calibri"/>
-          <w:b/>
-          <w:bCs/>
-          <w:color w:val="1B1F1F"/>
-          <w:sz w:val="21"/>
-          <w:szCs w:val="21"/>
-        </w:rPr>
-        <w:t xml:space="preserve">2. Đẩy mã lên nhánh nhóm và quan sát CI.</w:t>
-      </w:r>
-      <w:r>
-        <w:rPr>
-          <w:rFonts w:ascii="Calibri" w:cs="Calibri" w:eastAsia="Calibri" w:hAnsi="Calibri"/>
-          <w:color w:val="1B1F1F"/>
-          <w:sz w:val="21"/>
-          <w:szCs w:val="21"/>
-        </w:rPr>
-        <w:t xml:space="preserve"> Giai đoạn 1 (kiểm tra mã) chạy lần đầu. Xem nó xanh hay đỏ, và vì sao.</w:t>
+          <w:color w:val="1B1F1F"/>
+          <w:sz w:val="21"/>
+          <w:szCs w:val="21"/>
+        </w:rPr>
+        <w:t xml:space="preserve">So hai kết quả. Dòng "Truy hồi tri thức" báo </w:t>
+      </w:r>
+      <w:r>
+        <w:rPr>
+          <w:rFonts w:ascii="Consolas" w:cs="Consolas" w:eastAsia="Consolas" w:hAnsi="Consolas"/>
+          <w:color w:val="0B3F41"/>
+          <w:sz w:val="20"/>
+          <w:szCs w:val="20"/>
+        </w:rPr>
+        <w:t xml:space="preserve">FAIL</w:t>
+      </w:r>
+      <w:r>
+        <w:rPr>
+          <w:rFonts w:ascii="Calibri" w:cs="Calibri" w:eastAsia="Calibri" w:hAnsi="Calibri"/>
+          <w:color w:val="1B1F1F"/>
+          <w:sz w:val="21"/>
+          <w:szCs w:val="21"/>
+        </w:rPr>
+        <w:t xml:space="preserve"> (phần chia đoạn để trống, làm ở Lab 3) là bình thường ở Session 2.</w:t>
+      </w:r>
+    </w:p>
+    <w:p>
+      <w:pPr>
+        <w:tabs>
+          <w:tab w:val="left" w:pos="420"/>
+        </w:tabs>
+        <w:spacing w:after="70" w:line="300"/>
+        <w:ind w:left="420" w:hanging="300"/>
+      </w:pPr>
+      <w:r>
+        <w:rPr>
+          <w:rFonts w:ascii="Calibri" w:cs="Calibri" w:eastAsia="Calibri" w:hAnsi="Calibri"/>
+          <w:color w:val="1B1F1F"/>
+          <w:sz w:val="21"/>
+          <w:szCs w:val="21"/>
+        </w:rPr>
+        <w:t xml:space="preserve">2.	</w:t>
+      </w:r>
+      <w:r>
+        <w:rPr>
+          <w:rFonts w:ascii="Calibri" w:cs="Calibri" w:eastAsia="Calibri" w:hAnsi="Calibri"/>
+          <w:b/>
+          <w:bCs/>
+          <w:color w:val="1B1F1F"/>
+          <w:sz w:val="21"/>
+          <w:szCs w:val="21"/>
+        </w:rPr>
+        <w:t xml:space="preserve">Chạy giao diện và đọc một thông báo lỗi có chủ đích:</w:t>
+      </w:r>
+    </w:p>
+    <w:p>
+      <w:pPr>
+        <w:pBdr>
+          <w:top w:val="single" w:color="EEF3F2" w:sz="2" w:space="3"/>
+          <w:bottom w:val="single" w:color="EEF3F2" w:sz="2" w:space="3"/>
+          <w:left w:val="single" w:color="BFD3D2" w:sz="16" w:space="8"/>
+          <w:right w:val="single" w:color="EEF3F2" w:sz="2" w:space="3"/>
+        </w:pBdr>
+        <w:shd w:fill="EEF3F2" w:val="clear"/>
+        <w:spacing w:after="160" w:before="100" w:line="264"/>
+        <w:ind w:left="100"/>
+      </w:pPr>
+      <w:r>
+        <w:rPr>
+          <w:rFonts w:ascii="Consolas" w:cs="Consolas" w:eastAsia="Consolas" w:hAnsi="Consolas"/>
+          <w:color w:val="1B1F1F"/>
+          <w:sz w:val="19"/>
+          <w:szCs w:val="19"/>
+        </w:rPr>
+        <w:t xml:space="preserve">uv run streamlit run src/ui/app.py</w:t>
+      </w:r>
+    </w:p>
+    <w:p>
+      <w:pPr>
+        <w:spacing w:after="140" w:line="300"/>
+      </w:pPr>
+      <w:r>
+        <w:rPr>
+          <w:rFonts w:ascii="Calibri" w:cs="Calibri" w:eastAsia="Calibri" w:hAnsi="Calibri"/>
+          <w:color w:val="1B1F1F"/>
+          <w:sz w:val="21"/>
+          <w:szCs w:val="21"/>
+        </w:rPr>
+        <w:t xml:space="preserve">Gửi một ticket: hệ thống báo </w:t>
+      </w:r>
+      <w:r>
+        <w:rPr>
+          <w:rFonts w:ascii="Consolas" w:cs="Consolas" w:eastAsia="Consolas" w:hAnsi="Consolas"/>
+          <w:color w:val="0B3F41"/>
+          <w:sz w:val="20"/>
+          <w:szCs w:val="20"/>
+        </w:rPr>
+        <w:t xml:space="preserve">NotImplementedError</w:t>
+      </w:r>
+      <w:r>
+        <w:rPr>
+          <w:rFonts w:ascii="Calibri" w:cs="Calibri" w:eastAsia="Calibri" w:hAnsi="Calibri"/>
+          <w:color w:val="1B1F1F"/>
+          <w:sz w:val="21"/>
+          <w:szCs w:val="21"/>
+        </w:rPr>
+        <w:t xml:space="preserve"> vì </w:t>
+      </w:r>
+      <w:r>
+        <w:rPr>
+          <w:rFonts w:ascii="Consolas" w:cs="Consolas" w:eastAsia="Consolas" w:hAnsi="Consolas"/>
+          <w:color w:val="0B3F41"/>
+          <w:sz w:val="20"/>
+          <w:szCs w:val="20"/>
+        </w:rPr>
+        <w:t xml:space="preserve">process_ticket</w:t>
+      </w:r>
+      <w:r>
+        <w:rPr>
+          <w:rFonts w:ascii="Calibri" w:cs="Calibri" w:eastAsia="Calibri" w:hAnsi="Calibri"/>
+          <w:color w:val="1B1F1F"/>
+          <w:sz w:val="21"/>
+          <w:szCs w:val="21"/>
+        </w:rPr>
+        <w:t xml:space="preserve"> chưa được viết — đó là kết quả đúng ở Session 2. Đọc thông báo để chỉ ra tệp, hàm và tầng kiến trúc báo lỗi, rồi đánh giá cách trang gửi ticket gọi thẳng tầng điều phối.</w:t>
+      </w:r>
+    </w:p>
+    <w:p>
+      <w:pPr>
+        <w:tabs>
+          <w:tab w:val="left" w:pos="420"/>
+        </w:tabs>
+        <w:spacing w:after="70" w:line="300"/>
+        <w:ind w:left="420" w:hanging="300"/>
+      </w:pPr>
+      <w:r>
+        <w:rPr>
+          <w:rFonts w:ascii="Calibri" w:cs="Calibri" w:eastAsia="Calibri" w:hAnsi="Calibri"/>
+          <w:color w:val="1B1F1F"/>
+          <w:sz w:val="21"/>
+          <w:szCs w:val="21"/>
+        </w:rPr>
+        <w:t xml:space="preserve">3.	</w:t>
+      </w:r>
+      <w:r>
+        <w:rPr>
+          <w:rFonts w:ascii="Calibri" w:cs="Calibri" w:eastAsia="Calibri" w:hAnsi="Calibri"/>
+          <w:b/>
+          <w:bCs/>
+          <w:color w:val="1B1F1F"/>
+          <w:sz w:val="21"/>
+          <w:szCs w:val="21"/>
+        </w:rPr>
+        <w:t xml:space="preserve">Đẩy mã lên nhánh nhóm và quan sát CI:</w:t>
       </w:r>
     </w:p>
     <w:p>
@@ -1806,35 +2235,11 @@
       <w:r>
         <w:rPr>
           <w:rFonts w:ascii="Calibri" w:cs="Calibri" w:eastAsia="Calibri" w:hAnsi="Calibri"/>
-          <w:b/>
-          <w:bCs/>
-          <w:color w:val="1B1F1F"/>
-          <w:sz w:val="21"/>
-          <w:szCs w:val="21"/>
-        </w:rPr>
-        <w:t xml:space="preserve">3. Khởi động giao diện, gửi thử một ticket:</w:t>
-      </w:r>
-    </w:p>
-    <w:p>
-      <w:pPr>
-        <w:pBdr>
-          <w:top w:val="single" w:color="EEF3F2" w:sz="2" w:space="3"/>
-          <w:bottom w:val="single" w:color="EEF3F2" w:sz="2" w:space="3"/>
-          <w:left w:val="single" w:color="BFD3D2" w:sz="16" w:space="8"/>
-          <w:right w:val="single" w:color="EEF3F2" w:sz="2" w:space="3"/>
-        </w:pBdr>
-        <w:shd w:fill="EEF3F2" w:val="clear"/>
-        <w:spacing w:after="160" w:before="100" w:line="264"/>
-        <w:ind w:left="100"/>
-      </w:pPr>
-      <w:r>
-        <w:rPr>
-          <w:rFonts w:ascii="Consolas" w:cs="Consolas" w:eastAsia="Consolas" w:hAnsi="Consolas"/>
-          <w:color w:val="1B1F1F"/>
-          <w:sz w:val="19"/>
-          <w:szCs w:val="19"/>
-        </w:rPr>
-        <w:t xml:space="preserve">uv run streamlit run src/ui/app.py</w:t>
+          <w:color w:val="1B1F1F"/>
+          <w:sz w:val="21"/>
+          <w:szCs w:val="21"/>
+        </w:rPr>
+        <w:t xml:space="preserve">Giai đoạn 1 (kiểm tra mã) chạy lần đầu. Xem nó xanh hay đỏ, và vì sao.</w:t>
       </w:r>
     </w:p>
     <w:p>
@@ -1859,7 +2264,7 @@
           <w:sz w:val="21"/>
           <w:szCs w:val="21"/>
         </w:rPr>
-        <w:t xml:space="preserve"> hệ thống khung chạy được, CI xanh.</w:t>
+        <w:t xml:space="preserve"> kết quả so sánh L và S, ảnh chụp giao diện và thông báo lỗi, trạng thái CI.</w:t>
       </w:r>
     </w:p>
     <w:p>
@@ -1876,6 +2281,7 @@
     <w:p>
       <w:pPr>
         <w:pStyle w:val="Heading2"/>
+        <w:keepNext/>
         <w:spacing w:after="120" w:before="280"/>
       </w:pPr>
       <w:r>
@@ -1915,7 +2321,7 @@
           <w:sz w:val="21"/>
           <w:szCs w:val="21"/>
         </w:rPr>
-        <w:t xml:space="preserve"> — sơ đồ năm tầng, bảy mục và phương án dự phòng của từng thành phần</w:t>
+        <w:t xml:space="preserve"> — đủ chín mục, mỗi thành phần có phương án dự phòng</w:t>
       </w:r>
     </w:p>
     <w:p>
@@ -1934,7 +2340,7 @@
           <w:sz w:val="21"/>
           <w:szCs w:val="21"/>
         </w:rPr>
-        <w:t xml:space="preserve">Tối thiểu 5 ADR trong </w:t>
+        <w:t xml:space="preserve">Tối thiểu 5 ADR mới trong </w:t>
       </w:r>
       <w:r>
         <w:rPr>
@@ -1944,6 +2350,33 @@
           <w:szCs w:val="20"/>
         </w:rPr>
         <w:t xml:space="preserve">docs/adr/</w:t>
+      </w:r>
+      <w:r>
+        <w:rPr>
+          <w:rFonts w:ascii="Calibri" w:cs="Calibri" w:eastAsia="Calibri" w:hAnsi="Calibri"/>
+          <w:color w:val="1B1F1F"/>
+          <w:sz w:val="21"/>
+          <w:szCs w:val="21"/>
+        </w:rPr>
+        <w:t xml:space="preserve"> (từ </w:t>
+      </w:r>
+      <w:r>
+        <w:rPr>
+          <w:rFonts w:ascii="Consolas" w:cs="Consolas" w:eastAsia="Consolas" w:hAnsi="Consolas"/>
+          <w:color w:val="0B3F41"/>
+          <w:sz w:val="20"/>
+          <w:szCs w:val="20"/>
+        </w:rPr>
+        <w:t xml:space="preserve">0006</w:t>
+      </w:r>
+      <w:r>
+        <w:rPr>
+          <w:rFonts w:ascii="Calibri" w:cs="Calibri" w:eastAsia="Calibri" w:hAnsi="Calibri"/>
+          <w:color w:val="1B1F1F"/>
+          <w:sz w:val="21"/>
+          <w:szCs w:val="21"/>
+        </w:rPr>
+        <w:t xml:space="preserve">)</w:t>
       </w:r>
     </w:p>
     <w:p>
@@ -1962,7 +2395,7 @@
           <w:sz w:val="21"/>
           <w:szCs w:val="21"/>
         </w:rPr>
-        <w:t xml:space="preserve">Kết quả kiểm chứng chuyển đổi cấu hình không sửa mã</w:t>
+        <w:t xml:space="preserve">Workbook 2 đã điền, mọi câu phân tích có đủ ba phần: dẫn chứng · vì sao · nếu khác đi thì</w:t>
       </w:r>
     </w:p>
     <w:p>
@@ -1981,12 +2414,13 @@
           <w:sz w:val="21"/>
           <w:szCs w:val="21"/>
         </w:rPr>
-        <w:t xml:space="preserve">Ảnh chụp giao diện chạy được</w:t>
+        <w:t xml:space="preserve">Ảnh chụp giao diện chạy được và thông báo lỗi ở Bước 6</w:t>
       </w:r>
     </w:p>
     <w:p>
       <w:pPr>
         <w:pStyle w:val="Heading2"/>
+        <w:keepNext/>
         <w:spacing w:after="120" w:before="280"/>
       </w:pPr>
       <w:r>
@@ -2047,7 +2481,42 @@
     </w:p>
     <w:p>
       <w:pPr>
+        <w:spacing w:after="140" w:line="300"/>
+      </w:pPr>
+      <w:r>
+        <w:rPr>
+          <w:rFonts w:ascii="Calibri" w:cs="Calibri" w:eastAsia="Calibri" w:hAnsi="Calibri"/>
+          <w:color w:val="1B1F1F"/>
+          <w:sz w:val="21"/>
+          <w:szCs w:val="21"/>
+        </w:rPr>
+        <w:t xml:space="preserve">Công cụ này chỉ xác nhận các tệp </w:t>
+      </w:r>
+      <w:r>
+        <w:rPr>
+          <w:rFonts w:ascii="Calibri" w:cs="Calibri" w:eastAsia="Calibri" w:hAnsi="Calibri"/>
+          <w:b/>
+          <w:bCs/>
+          <w:color w:val="1B1F1F"/>
+          <w:sz w:val="21"/>
+          <w:szCs w:val="21"/>
+        </w:rPr>
+        <w:t xml:space="preserve">có tồn tại</w:t>
+      </w:r>
+      <w:r>
+        <w:rPr>
+          <w:rFonts w:ascii="Calibri" w:cs="Calibri" w:eastAsia="Calibri" w:hAnsi="Calibri"/>
+          <w:color w:val="1B1F1F"/>
+          <w:sz w:val="21"/>
+          <w:szCs w:val="21"/>
+        </w:rPr>
+        <w:t xml:space="preserve"> và bài kiểm thử cấu hình còn xanh; nó không đọc nội dung Blueprint hay ADR. Chất lượng do giảng viên chấm theo thang dưới đây.</w:t>
+      </w:r>
+    </w:p>
+    <w:p>
+      <w:pPr>
         <w:pStyle w:val="Heading2"/>
+        <w:keepNext/>
         <w:spacing w:after="120" w:before="280"/>
       </w:pPr>
       <w:r>
@@ -2064,7 +2533,7 @@
     </w:p>
     <w:tbl>
       <w:tblPr>
-        <w:tblW w:type="dxa" w:w="9200"/>
+        <w:tblW w:type="dxa" w:w="9300"/>
         <w:tblBorders>
           <w:top w:val="single" w:color="BFD3D2" w:sz="4"/>
           <w:left w:val="single" w:color="BFD3D2" w:sz="4"/>
@@ -2075,8 +2544,8 @@
         </w:tblBorders>
       </w:tblPr>
       <w:tblGrid>
-        <w:gridCol w:w="8000"/>
-        <w:gridCol w:w="1200"/>
+        <w:gridCol w:w="7812"/>
+        <w:gridCol w:w="1488"/>
       </w:tblGrid>
       <w:tr>
         <w:trPr>
@@ -2084,7 +2553,7 @@
         </w:trPr>
         <w:tc>
           <w:tcPr>
-            <w:tcW w:type="dxa" w:w="8000"/>
+            <w:tcW w:type="dxa" w:w="7812"/>
             <w:shd w:fill="DCEBEA" w:val="clear"/>
             <w:tcMar>
               <w:top w:type="dxa" w:w="80"/>
@@ -2110,7 +2579,7 @@
         </w:tc>
         <w:tc>
           <w:tcPr>
-            <w:tcW w:type="dxa" w:w="1200"/>
+            <w:tcW w:type="dxa" w:w="1488"/>
             <w:shd w:fill="DCEBEA" w:val="clear"/>
             <w:tcMar>
               <w:top w:type="dxa" w:w="80"/>
@@ -2141,7 +2610,7 @@
         </w:trPr>
         <w:tc>
           <w:tcPr>
-            <w:tcW w:type="dxa" w:w="8000"/>
+            <w:tcW w:type="dxa" w:w="7812"/>
             <w:tcMar>
               <w:top w:type="dxa" w:w="80"/>
               <w:left w:type="dxa" w:w="100"/>
@@ -2160,13 +2629,13 @@
                 <w:sz w:val="20"/>
                 <w:szCs w:val="20"/>
               </w:rPr>
-              <w:t xml:space="preserve">Sơ đồ kiến trúc đủ năm tầng theo slide 10, rõ trách nhiệm và ranh giới</w:t>
+              <w:t xml:space="preserve">Bản đồ thành phần và ranh giới đúng, dẫn chứng chỉ ra được tệp hoặc mục SPEC</w:t>
             </w:r>
           </w:p>
         </w:tc>
         <w:tc>
           <w:tcPr>
-            <w:tcW w:type="dxa" w:w="1200"/>
+            <w:tcW w:type="dxa" w:w="1488"/>
             <w:tcMar>
               <w:top w:type="dxa" w:w="80"/>
               <w:left w:type="dxa" w:w="100"/>
@@ -2185,7 +2654,7 @@
                 <w:sz w:val="20"/>
                 <w:szCs w:val="20"/>
               </w:rPr>
-              <w:t xml:space="preserve">3</w:t>
+              <w:t xml:space="preserve">2</w:t>
             </w:r>
           </w:p>
         </w:tc>
@@ -2196,7 +2665,7 @@
         </w:trPr>
         <w:tc>
           <w:tcPr>
-            <w:tcW w:type="dxa" w:w="8000"/>
+            <w:tcW w:type="dxa" w:w="7812"/>
             <w:shd w:fill="F2F7F6" w:val="clear"/>
             <w:tcMar>
               <w:top w:type="dxa" w:w="80"/>
@@ -2216,13 +2685,13 @@
                 <w:sz w:val="20"/>
                 <w:szCs w:val="20"/>
               </w:rPr>
-              <w:t xml:space="preserve">Mỗi thành phần có phương án dự phòng; Blueprint đủ bảy mục</w:t>
+              <w:t xml:space="preserve">Chất lượng phân tích trong workbook: đủ ba phần, lập luận có cân nhắc đánh đổi</w:t>
             </w:r>
           </w:p>
         </w:tc>
         <w:tc>
           <w:tcPr>
-            <w:tcW w:type="dxa" w:w="1200"/>
+            <w:tcW w:type="dxa" w:w="1488"/>
             <w:shd w:fill="F2F7F6" w:val="clear"/>
             <w:tcMar>
               <w:top w:type="dxa" w:w="80"/>
@@ -2253,7 +2722,7 @@
         </w:trPr>
         <w:tc>
           <w:tcPr>
-            <w:tcW w:type="dxa" w:w="8000"/>
+            <w:tcW w:type="dxa" w:w="7812"/>
             <w:tcMar>
               <w:top w:type="dxa" w:w="80"/>
               <w:left w:type="dxa" w:w="100"/>
@@ -2272,13 +2741,70 @@
                 <w:sz w:val="20"/>
                 <w:szCs w:val="20"/>
               </w:rPr>
-              <w:t xml:space="preserve">≥ 5 ADR đúng mẫu, nêu được phương án đã loại</w:t>
+              <w:t xml:space="preserve">Blueprint đủ chín mục, mỗi thành phần có phương án dự phòng</w:t>
             </w:r>
           </w:p>
         </w:tc>
         <w:tc>
           <w:tcPr>
-            <w:tcW w:type="dxa" w:w="1200"/>
+            <w:tcW w:type="dxa" w:w="1488"/>
+            <w:tcMar>
+              <w:top w:type="dxa" w:w="80"/>
+              <w:left w:type="dxa" w:w="100"/>
+              <w:bottom w:type="dxa" w:w="80"/>
+              <w:right w:type="dxa" w:w="100"/>
+            </w:tcMar>
+            <w:vAlign w:val="top"/>
+          </w:tcPr>
+          <w:p>
+            <w:r>
+              <w:rPr>
+                <w:rFonts w:ascii="Calibri" w:cs="Calibri" w:eastAsia="Calibri" w:hAnsi="Calibri"/>
+                <w:b w:val="false"/>
+                <w:bCs w:val="false"/>
+                <w:color w:val="1B1F1F"/>
+                <w:sz w:val="20"/>
+                <w:szCs w:val="20"/>
+              </w:rPr>
+              <w:t xml:space="preserve">2</w:t>
+            </w:r>
+          </w:p>
+        </w:tc>
+      </w:tr>
+      <w:tr>
+        <w:trPr>
+          <w:cantSplit/>
+        </w:trPr>
+        <w:tc>
+          <w:tcPr>
+            <w:tcW w:type="dxa" w:w="7812"/>
+            <w:shd w:fill="F2F7F6" w:val="clear"/>
+            <w:tcMar>
+              <w:top w:type="dxa" w:w="80"/>
+              <w:left w:type="dxa" w:w="100"/>
+              <w:bottom w:type="dxa" w:w="80"/>
+              <w:right w:type="dxa" w:w="100"/>
+            </w:tcMar>
+            <w:vAlign w:val="top"/>
+          </w:tcPr>
+          <w:p>
+            <w:r>
+              <w:rPr>
+                <w:rFonts w:ascii="Calibri" w:cs="Calibri" w:eastAsia="Calibri" w:hAnsi="Calibri"/>
+                <w:b w:val="false"/>
+                <w:bCs w:val="false"/>
+                <w:color w:val="1B1F1F"/>
+                <w:sz w:val="20"/>
+                <w:szCs w:val="20"/>
+              </w:rPr>
+              <w:t xml:space="preserve">≥ 5 ADR đúng mẫu, nêu được phương án đã loại và lý do loại</w:t>
+            </w:r>
+          </w:p>
+        </w:tc>
+        <w:tc>
+          <w:tcPr>
+            <w:tcW w:type="dxa" w:w="1488"/>
+            <w:shd w:fill="F2F7F6" w:val="clear"/>
             <w:tcMar>
               <w:top w:type="dxa" w:w="80"/>
               <w:left w:type="dxa" w:w="100"/>
@@ -2308,8 +2834,7 @@
         </w:trPr>
         <w:tc>
           <w:tcPr>
-            <w:tcW w:type="dxa" w:w="8000"/>
-            <w:shd w:fill="F2F7F6" w:val="clear"/>
+            <w:tcW w:type="dxa" w:w="7812"/>
             <w:tcMar>
               <w:top w:type="dxa" w:w="80"/>
               <w:left w:type="dxa" w:w="100"/>
@@ -2328,14 +2853,13 @@
                 <w:sz w:val="20"/>
                 <w:szCs w:val="20"/>
               </w:rPr>
-              <w:t xml:space="preserve">Khung khởi động được, CI xanh</w:t>
+              <w:t xml:space="preserve">Chạy được khung hệ thống, chuyển cấu hình không sửa mã, CI đã chạy</w:t>
             </w:r>
           </w:p>
         </w:tc>
         <w:tc>
           <w:tcPr>
-            <w:tcW w:type="dxa" w:w="1200"/>
-            <w:shd w:fill="F2F7F6" w:val="clear"/>
+            <w:tcW w:type="dxa" w:w="1488"/>
             <w:tcMar>
               <w:top w:type="dxa" w:w="80"/>
               <w:left w:type="dxa" w:w="100"/>
@@ -2354,7 +2878,7 @@
                 <w:sz w:val="20"/>
                 <w:szCs w:val="20"/>
               </w:rPr>
-              <w:t xml:space="preserve">2</w:t>
+              <w:t xml:space="preserve">1</w:t>
             </w:r>
           </w:p>
         </w:tc>
@@ -2368,6 +2892,7 @@
     <w:p>
       <w:pPr>
         <w:pStyle w:val="Heading2"/>
+        <w:keepNext/>
         <w:spacing w:after="120" w:before="280"/>
       </w:pPr>
       <w:r>
@@ -2417,7 +2942,110 @@
           <w:sz w:val="21"/>
           <w:szCs w:val="21"/>
         </w:rPr>
+        <w:t xml:space="preserve">So sánh </w:t>
+      </w:r>
+      <w:r>
+        <w:rPr>
+          <w:rFonts w:ascii="Consolas" w:cs="Consolas" w:eastAsia="Consolas" w:hAnsi="Consolas"/>
+          <w:color w:val="0B3F41"/>
+          <w:sz w:val="20"/>
+          <w:szCs w:val="20"/>
+        </w:rPr>
+        <w:t xml:space="preserve">SPEC-FLOW-02</w:t>
+      </w:r>
+      <w:r>
+        <w:rPr>
+          <w:rFonts w:ascii="Calibri" w:cs="Calibri" w:eastAsia="Calibri" w:hAnsi="Calibri"/>
+          <w:color w:val="1B1F1F"/>
+          <w:sz w:val="21"/>
+          <w:szCs w:val="21"/>
+        </w:rPr>
+        <w:t xml:space="preserve"> (tám điều kiện chuyển người) với </w:t>
+      </w:r>
+      <w:r>
+        <w:rPr>
+          <w:rFonts w:ascii="Consolas" w:cs="Consolas" w:eastAsia="Consolas" w:hAnsi="Consolas"/>
+          <w:color w:val="0B3F41"/>
+          <w:sz w:val="20"/>
+          <w:szCs w:val="20"/>
+        </w:rPr>
+        <w:t xml:space="preserve">EscalationReason</w:t>
+      </w:r>
+      <w:r>
+        <w:rPr>
+          <w:rFonts w:ascii="Calibri" w:cs="Calibri" w:eastAsia="Calibri" w:hAnsi="Calibri"/>
+          <w:color w:val="1B1F1F"/>
+          <w:sz w:val="21"/>
+          <w:szCs w:val="21"/>
+        </w:rPr>
+        <w:t xml:space="preserve"> trong mã (bảy lý do): điều kiện nào có trong tài liệu mà chưa có trong mã, và rủi ro của việc lệch nhau.</w:t>
+      </w:r>
+    </w:p>
+    <w:p>
+      <w:pPr>
+        <w:pStyle w:val="ListParagraph"/>
+        <w:numPr>
+          <w:ilvl w:val="0"/>
+          <w:numId w:val="2"/>
+        </w:numPr>
+        <w:spacing w:after="70" w:line="300"/>
+      </w:pPr>
+      <w:r>
+        <w:rPr>
+          <w:rFonts w:ascii="Calibri" w:cs="Calibri" w:eastAsia="Calibri" w:hAnsi="Calibri"/>
+          <w:color w:val="1B1F1F"/>
+          <w:sz w:val="21"/>
+          <w:szCs w:val="21"/>
+        </w:rPr>
         <w:t xml:space="preserve">Vẽ sơ đồ tuần tự cho luồng xử lý một ticket có gọi công cụ — dự đoán trước cấu trúc sẽ xây ở Session 4.</w:t>
+      </w:r>
+    </w:p>
+    <w:p>
+      <w:pPr>
+        <w:pBdr>
+          <w:bottom w:val="single" w:color="BFD3D2" w:sz="4" w:space="1"/>
+        </w:pBdr>
+        <w:spacing w:after="200" w:before="120"/>
+      </w:pPr>
+      <w:r>
+        <w:t xml:space="preserve"/>
+      </w:r>
+    </w:p>
+    <w:p>
+      <w:pPr>
+        <w:pBdr>
+          <w:top w:val="single" w:color="FBF2E1" w:sz="2" w:space="4"/>
+          <w:bottom w:val="single" w:color="FBF2E1" w:sz="2" w:space="4"/>
+          <w:left w:val="single" w:color="B8860B" w:sz="24" w:space="8"/>
+          <w:right w:val="single" w:color="FBF2E1" w:sz="2" w:space="4"/>
+        </w:pBdr>
+        <w:shd w:fill="FBF2E1" w:val="clear"/>
+        <w:spacing w:after="200" w:before="100" w:line="300"/>
+        <w:ind w:left="100"/>
+      </w:pPr>
+      <w:r>
+        <w:rPr>
+          <w:rFonts w:ascii="Calibri" w:cs="Calibri" w:eastAsia="Calibri" w:hAnsi="Calibri"/>
+          <w:b/>
+          <w:bCs/>
+          <w:i/>
+          <w:iCs/>
+          <w:color w:val="1B1F1F"/>
+          <w:sz w:val="20"/>
+          <w:szCs w:val="20"/>
+        </w:rPr>
+        <w:t xml:space="preserve">Bảng quyết định thiết kế ở Bước 5 chính là tài liệu dùng để phản biện ở Session 6.</w:t>
+      </w:r>
+      <w:r>
+        <w:rPr>
+          <w:rFonts w:ascii="Calibri" w:cs="Calibri" w:eastAsia="Calibri" w:hAnsi="Calibri"/>
+          <w:i/>
+          <w:iCs/>
+          <w:color w:val="1B1F1F"/>
+          <w:sz w:val="20"/>
+          <w:szCs w:val="20"/>
+        </w:rPr>
+        <w:t xml:space="preserve"> Ghi chép nghiêm túc từ bây giờ thay vì cố nhớ lại vào ngày cuối. Phần bảo vệ quyết định thiết kế chiếm 1,5/10 điểm cuối khóa.</w:t>
       </w:r>
     </w:p>
     <w:sectPr>

</xml_diff>